<commit_message>
Docs: Adding section B
</commit_message>
<xml_diff>
--- a/Section_B_Answers-(Sipho-Sehlapelo).docx
+++ b/Section_B_Answers-(Sipho-Sehlapelo).docx
@@ -2728,2814 +2728,6 @@
           </w:p>
         </w:tc>
       </w:tr>
-      <w:tr xmlns:wp14="http://schemas.microsoft.com/office/word/2010/wordml" wp14:textId="77777777">
-        <w:tc>
-          <w:tcPr>
-            <w:tcW w:w="9465" w:type="dxa"/>
-            <w:gridSpan w:val="4"/>
-            <w:shd w:val="clear" w:color="auto" w:fill="D9D9D9" w:themeFill="background1" w:themeFillShade="D9"/>
-            <w:tcMar>
-              <w:top w:w="100" w:type="dxa"/>
-              <w:left w:w="150" w:type="dxa"/>
-              <w:bottom w:w="100" w:type="dxa"/>
-              <w:left w:w="150" w:type="dxa"/>
-              <w:right w:w="150" w:type="dxa"/>
-            </w:tcMar>
-          </w:tcPr>
-          <w:p wp14:textId="77777777">
-            <w:pPr>
-              <w:jc w:val="center"/>
-              <w:rPr>
-                <w:rFonts w:ascii="Times New Roman" w:hAnsi="Times New Roman" w:eastAsia="Times New Roman" w:cs="Times New Roman"/>
-                <w:b w:val="1"/>
-                <w:bCs w:val="1"/>
-                <w:color w:val="auto"/>
-                <w:sz w:val="22"/>
-                <w:szCs w:val="22"/>
-              </w:rPr>
-            </w:pPr>
-            <w:r>
-              <w:rPr>
-                <w:rFonts w:ascii="Times New Roman" w:hAnsi="Times New Roman" w:eastAsia="Times New Roman" w:cs="Times New Roman"/>
-                <w:b w:val="1"/>
-                <w:bCs w:val="1"/>
-                <w:color w:val="auto"/>
-                <w:sz w:val="22"/>
-                <w:szCs w:val="22"/>
-              </w:rPr>
-              <w:t>Main Script: Account Number Input</w:t>
-            </w:r>
-          </w:p>
-        </w:tc>
-      </w:tr>
-      <w:tr xmlns:wp14="http://schemas.microsoft.com/office/word/2010/wordml" wp14:textId="77777777">
-        <w:tc>
-          <w:tcPr>
-            <w:tcW w:w="810" w:type="dxa"/>
-            <w:tcMar>
-              <w:top w:w="80" w:type="dxa"/>
-              <w:left w:w="150" w:type="dxa"/>
-              <w:bottom w:w="80" w:type="dxa"/>
-              <w:left w:w="150" w:type="dxa"/>
-              <w:right w:w="150" w:type="dxa"/>
-            </w:tcMar>
-          </w:tcPr>
-          <w:p wp14:textId="77777777">
-            <w:pPr>
-              <w:rPr>
-                <w:rFonts w:ascii="Times New Roman" w:hAnsi="Times New Roman" w:eastAsia="Times New Roman" w:cs="Times New Roman"/>
-                <w:color w:val="auto"/>
-                <w:sz w:val="22"/>
-                <w:szCs w:val="22"/>
-              </w:rPr>
-            </w:pPr>
-            <w:r>
-              <w:rPr>
-                <w:rFonts w:ascii="Times New Roman" w:hAnsi="Times New Roman" w:eastAsia="Times New Roman" w:cs="Times New Roman"/>
-                <w:color w:val="auto"/>
-                <w:sz w:val="22"/>
-                <w:szCs w:val="22"/>
-              </w:rPr>
-              <w:t>TC1</w:t>
-            </w:r>
-          </w:p>
-        </w:tc>
-        <w:tc>
-          <w:tcPr>
-            <w:tcW w:w="3720" w:type="dxa"/>
-            <w:tcMar>
-              <w:top w:w="80" w:type="dxa"/>
-              <w:left w:w="150" w:type="dxa"/>
-              <w:bottom w:w="80" w:type="dxa"/>
-              <w:left w:w="150" w:type="dxa"/>
-              <w:right w:w="150" w:type="dxa"/>
-            </w:tcMar>
-          </w:tcPr>
-          <w:p wp14:textId="77777777">
-            <w:pPr>
-              <w:rPr>
-                <w:rFonts w:ascii="Times New Roman" w:hAnsi="Times New Roman" w:eastAsia="Times New Roman" w:cs="Times New Roman"/>
-                <w:color w:val="auto"/>
-                <w:sz w:val="22"/>
-                <w:szCs w:val="22"/>
-              </w:rPr>
-            </w:pPr>
-            <w:r>
-              <w:rPr>
-                <w:rFonts w:ascii="Times New Roman" w:hAnsi="Times New Roman" w:eastAsia="Times New Roman" w:cs="Times New Roman"/>
-                <w:color w:val="auto"/>
-                <w:sz w:val="22"/>
-                <w:szCs w:val="22"/>
-              </w:rPr>
-              <w:t>straccountNo = ""</w:t>
-            </w:r>
-          </w:p>
-        </w:tc>
-        <w:tc>
-          <w:tcPr>
-            <w:tcW w:w="2490" w:type="dxa"/>
-            <w:tcMar>
-              <w:top w:w="80" w:type="dxa"/>
-              <w:left w:w="150" w:type="dxa"/>
-              <w:bottom w:w="80" w:type="dxa"/>
-              <w:left w:w="150" w:type="dxa"/>
-              <w:right w:w="150" w:type="dxa"/>
-            </w:tcMar>
-          </w:tcPr>
-          <w:p wp14:textId="77777777">
-            <w:pPr>
-              <w:jc w:val="center"/>
-              <w:rPr>
-                <w:rFonts w:ascii="Times New Roman" w:hAnsi="Times New Roman" w:eastAsia="Times New Roman" w:cs="Times New Roman"/>
-                <w:color w:val="auto"/>
-                <w:sz w:val="22"/>
-                <w:szCs w:val="22"/>
-              </w:rPr>
-            </w:pPr>
-            <w:r>
-              <w:rPr>
-                <w:rFonts w:ascii="Times New Roman" w:hAnsi="Times New Roman" w:eastAsia="Times New Roman" w:cs="Times New Roman"/>
-                <w:color w:val="auto"/>
-                <w:sz w:val="22"/>
-                <w:szCs w:val="22"/>
-              </w:rPr>
-              <w:t>33%</w:t>
-            </w:r>
-          </w:p>
-        </w:tc>
-        <w:tc>
-          <w:tcPr>
-            <w:tcW w:w="2445" w:type="dxa"/>
-            <w:tcMar>
-              <w:top w:w="80" w:type="dxa"/>
-              <w:left w:w="150" w:type="dxa"/>
-              <w:bottom w:w="80" w:type="dxa"/>
-              <w:left w:w="150" w:type="dxa"/>
-              <w:right w:w="150" w:type="dxa"/>
-            </w:tcMar>
-          </w:tcPr>
-          <w:p wp14:textId="77777777">
-            <w:pPr>
-              <w:jc w:val="center"/>
-              <w:rPr>
-                <w:rFonts w:ascii="Times New Roman" w:hAnsi="Times New Roman" w:eastAsia="Times New Roman" w:cs="Times New Roman"/>
-                <w:color w:val="auto"/>
-                <w:sz w:val="22"/>
-                <w:szCs w:val="22"/>
-              </w:rPr>
-            </w:pPr>
-            <w:r>
-              <w:rPr>
-                <w:rFonts w:ascii="Times New Roman" w:hAnsi="Times New Roman" w:eastAsia="Times New Roman" w:cs="Times New Roman"/>
-                <w:color w:val="auto"/>
-                <w:sz w:val="22"/>
-                <w:szCs w:val="22"/>
-              </w:rPr>
-              <w:t>33%</w:t>
-            </w:r>
-          </w:p>
-        </w:tc>
-      </w:tr>
-      <w:tr xmlns:wp14="http://schemas.microsoft.com/office/word/2010/wordml" wp14:textId="77777777">
-        <w:tc>
-          <w:tcPr>
-            <w:tcW w:w="810" w:type="dxa"/>
-            <w:tcMar>
-              <w:top w:w="80" w:type="dxa"/>
-              <w:left w:w="150" w:type="dxa"/>
-              <w:bottom w:w="80" w:type="dxa"/>
-              <w:left w:w="150" w:type="dxa"/>
-              <w:right w:w="150" w:type="dxa"/>
-            </w:tcMar>
-          </w:tcPr>
-          <w:p wp14:textId="77777777">
-            <w:pPr>
-              <w:rPr>
-                <w:rFonts w:ascii="Times New Roman" w:hAnsi="Times New Roman" w:eastAsia="Times New Roman" w:cs="Times New Roman"/>
-                <w:color w:val="auto"/>
-                <w:sz w:val="22"/>
-                <w:szCs w:val="22"/>
-              </w:rPr>
-            </w:pPr>
-            <w:r>
-              <w:rPr>
-                <w:rFonts w:ascii="Times New Roman" w:hAnsi="Times New Roman" w:eastAsia="Times New Roman" w:cs="Times New Roman"/>
-                <w:color w:val="auto"/>
-                <w:sz w:val="22"/>
-                <w:szCs w:val="22"/>
-              </w:rPr>
-              <w:t>TC2</w:t>
-            </w:r>
-          </w:p>
-        </w:tc>
-        <w:tc>
-          <w:tcPr>
-            <w:tcW w:w="3720" w:type="dxa"/>
-            <w:tcMar>
-              <w:top w:w="80" w:type="dxa"/>
-              <w:left w:w="150" w:type="dxa"/>
-              <w:bottom w:w="80" w:type="dxa"/>
-              <w:left w:w="150" w:type="dxa"/>
-              <w:right w:w="150" w:type="dxa"/>
-            </w:tcMar>
-          </w:tcPr>
-          <w:p wp14:textId="77777777">
-            <w:pPr>
-              <w:rPr>
-                <w:rFonts w:ascii="Times New Roman" w:hAnsi="Times New Roman" w:eastAsia="Times New Roman" w:cs="Times New Roman"/>
-                <w:color w:val="auto"/>
-                <w:sz w:val="22"/>
-                <w:szCs w:val="22"/>
-              </w:rPr>
-            </w:pPr>
-            <w:r>
-              <w:rPr>
-                <w:rFonts w:ascii="Times New Roman" w:hAnsi="Times New Roman" w:eastAsia="Times New Roman" w:cs="Times New Roman"/>
-                <w:color w:val="auto"/>
-                <w:sz w:val="22"/>
-                <w:szCs w:val="22"/>
-              </w:rPr>
-              <w:t>straccountNo = "1234"</w:t>
-            </w:r>
-          </w:p>
-        </w:tc>
-        <w:tc>
-          <w:tcPr>
-            <w:tcW w:w="2490" w:type="dxa"/>
-            <w:tcMar>
-              <w:top w:w="80" w:type="dxa"/>
-              <w:left w:w="150" w:type="dxa"/>
-              <w:bottom w:w="80" w:type="dxa"/>
-              <w:left w:w="150" w:type="dxa"/>
-              <w:right w:w="150" w:type="dxa"/>
-            </w:tcMar>
-          </w:tcPr>
-          <w:p wp14:textId="77777777">
-            <w:pPr>
-              <w:jc w:val="center"/>
-              <w:rPr>
-                <w:rFonts w:ascii="Times New Roman" w:hAnsi="Times New Roman" w:eastAsia="Times New Roman" w:cs="Times New Roman"/>
-                <w:color w:val="auto"/>
-                <w:sz w:val="22"/>
-                <w:szCs w:val="22"/>
-              </w:rPr>
-            </w:pPr>
-            <w:r>
-              <w:rPr>
-                <w:rFonts w:ascii="Times New Roman" w:hAnsi="Times New Roman" w:eastAsia="Times New Roman" w:cs="Times New Roman"/>
-                <w:color w:val="auto"/>
-                <w:sz w:val="22"/>
-                <w:szCs w:val="22"/>
-              </w:rPr>
-              <w:t>66%</w:t>
-            </w:r>
-          </w:p>
-        </w:tc>
-        <w:tc>
-          <w:tcPr>
-            <w:tcW w:w="2445" w:type="dxa"/>
-            <w:tcMar>
-              <w:top w:w="80" w:type="dxa"/>
-              <w:left w:w="150" w:type="dxa"/>
-              <w:bottom w:w="80" w:type="dxa"/>
-              <w:left w:w="150" w:type="dxa"/>
-              <w:right w:w="150" w:type="dxa"/>
-            </w:tcMar>
-          </w:tcPr>
-          <w:p wp14:textId="77777777">
-            <w:pPr>
-              <w:jc w:val="center"/>
-              <w:rPr>
-                <w:rFonts w:ascii="Times New Roman" w:hAnsi="Times New Roman" w:eastAsia="Times New Roman" w:cs="Times New Roman"/>
-                <w:color w:val="auto"/>
-                <w:sz w:val="22"/>
-                <w:szCs w:val="22"/>
-              </w:rPr>
-            </w:pPr>
-            <w:r>
-              <w:rPr>
-                <w:rFonts w:ascii="Times New Roman" w:hAnsi="Times New Roman" w:eastAsia="Times New Roman" w:cs="Times New Roman"/>
-                <w:color w:val="auto"/>
-                <w:sz w:val="22"/>
-                <w:szCs w:val="22"/>
-              </w:rPr>
-              <w:t>66%</w:t>
-            </w:r>
-          </w:p>
-        </w:tc>
-      </w:tr>
-      <w:tr xmlns:wp14="http://schemas.microsoft.com/office/word/2010/wordml" wp14:textId="77777777">
-        <w:tc>
-          <w:tcPr>
-            <w:tcW w:w="810" w:type="dxa"/>
-            <w:tcMar>
-              <w:top w:w="80" w:type="dxa"/>
-              <w:left w:w="150" w:type="dxa"/>
-              <w:bottom w:w="80" w:type="dxa"/>
-              <w:left w:w="150" w:type="dxa"/>
-              <w:right w:w="150" w:type="dxa"/>
-            </w:tcMar>
-          </w:tcPr>
-          <w:p wp14:textId="77777777">
-            <w:pPr>
-              <w:rPr>
-                <w:rFonts w:ascii="Times New Roman" w:hAnsi="Times New Roman" w:eastAsia="Times New Roman" w:cs="Times New Roman"/>
-                <w:color w:val="auto"/>
-                <w:sz w:val="22"/>
-                <w:szCs w:val="22"/>
-              </w:rPr>
-            </w:pPr>
-            <w:r>
-              <w:rPr>
-                <w:rFonts w:ascii="Times New Roman" w:hAnsi="Times New Roman" w:eastAsia="Times New Roman" w:cs="Times New Roman"/>
-                <w:color w:val="auto"/>
-                <w:sz w:val="22"/>
-                <w:szCs w:val="22"/>
-              </w:rPr>
-              <w:t>TC3</w:t>
-            </w:r>
-          </w:p>
-        </w:tc>
-        <w:tc>
-          <w:tcPr>
-            <w:tcW w:w="3720" w:type="dxa"/>
-            <w:tcMar>
-              <w:top w:w="80" w:type="dxa"/>
-              <w:left w:w="150" w:type="dxa"/>
-              <w:bottom w:w="80" w:type="dxa"/>
-              <w:left w:w="150" w:type="dxa"/>
-              <w:right w:w="150" w:type="dxa"/>
-            </w:tcMar>
-          </w:tcPr>
-          <w:p wp14:textId="77777777">
-            <w:pPr>
-              <w:rPr>
-                <w:rFonts w:ascii="Times New Roman" w:hAnsi="Times New Roman" w:eastAsia="Times New Roman" w:cs="Times New Roman"/>
-                <w:color w:val="auto"/>
-                <w:sz w:val="22"/>
-                <w:szCs w:val="22"/>
-              </w:rPr>
-            </w:pPr>
-            <w:r>
-              <w:rPr>
-                <w:rFonts w:ascii="Times New Roman" w:hAnsi="Times New Roman" w:eastAsia="Times New Roman" w:cs="Times New Roman"/>
-                <w:color w:val="auto"/>
-                <w:sz w:val="22"/>
-                <w:szCs w:val="22"/>
-              </w:rPr>
-              <w:t>straccountNo = "12345678"</w:t>
-            </w:r>
-          </w:p>
-        </w:tc>
-        <w:tc>
-          <w:tcPr>
-            <w:tcW w:w="2490" w:type="dxa"/>
-            <w:tcMar>
-              <w:top w:w="80" w:type="dxa"/>
-              <w:left w:w="150" w:type="dxa"/>
-              <w:bottom w:w="80" w:type="dxa"/>
-              <w:left w:w="150" w:type="dxa"/>
-              <w:right w:w="150" w:type="dxa"/>
-            </w:tcMar>
-          </w:tcPr>
-          <w:p wp14:textId="77777777">
-            <w:pPr>
-              <w:jc w:val="center"/>
-              <w:rPr>
-                <w:rFonts w:ascii="Times New Roman" w:hAnsi="Times New Roman" w:eastAsia="Times New Roman" w:cs="Times New Roman"/>
-                <w:color w:val="auto"/>
-                <w:sz w:val="22"/>
-                <w:szCs w:val="22"/>
-              </w:rPr>
-            </w:pPr>
-            <w:r>
-              <w:rPr>
-                <w:rFonts w:ascii="Times New Roman" w:hAnsi="Times New Roman" w:eastAsia="Times New Roman" w:cs="Times New Roman"/>
-                <w:color w:val="auto"/>
-                <w:sz w:val="22"/>
-                <w:szCs w:val="22"/>
-              </w:rPr>
-              <w:t>100%</w:t>
-            </w:r>
-          </w:p>
-        </w:tc>
-        <w:tc>
-          <w:tcPr>
-            <w:tcW w:w="2445" w:type="dxa"/>
-            <w:tcMar>
-              <w:top w:w="80" w:type="dxa"/>
-              <w:left w:w="150" w:type="dxa"/>
-              <w:bottom w:w="80" w:type="dxa"/>
-              <w:left w:w="150" w:type="dxa"/>
-              <w:right w:w="150" w:type="dxa"/>
-            </w:tcMar>
-          </w:tcPr>
-          <w:p wp14:textId="77777777">
-            <w:pPr>
-              <w:jc w:val="center"/>
-              <w:rPr>
-                <w:rFonts w:ascii="Times New Roman" w:hAnsi="Times New Roman" w:eastAsia="Times New Roman" w:cs="Times New Roman"/>
-                <w:color w:val="auto"/>
-                <w:sz w:val="22"/>
-                <w:szCs w:val="22"/>
-              </w:rPr>
-            </w:pPr>
-            <w:r>
-              <w:rPr>
-                <w:rFonts w:ascii="Times New Roman" w:hAnsi="Times New Roman" w:eastAsia="Times New Roman" w:cs="Times New Roman"/>
-                <w:color w:val="auto"/>
-                <w:sz w:val="22"/>
-                <w:szCs w:val="22"/>
-              </w:rPr>
-              <w:t>100%</w:t>
-            </w:r>
-          </w:p>
-        </w:tc>
-      </w:tr>
-      <w:tr xmlns:wp14="http://schemas.microsoft.com/office/word/2010/wordml" wp14:textId="77777777">
-        <w:tc>
-          <w:tcPr>
-            <w:tcW w:w="9465" w:type="dxa"/>
-            <w:gridSpan w:val="4"/>
-            <w:shd w:val="clear" w:color="auto" w:fill="D9D9D9" w:themeFill="background1" w:themeFillShade="D9"/>
-            <w:tcMar>
-              <w:top w:w="100" w:type="dxa"/>
-              <w:left w:w="150" w:type="dxa"/>
-              <w:bottom w:w="100" w:type="dxa"/>
-              <w:left w:w="150" w:type="dxa"/>
-              <w:right w:w="150" w:type="dxa"/>
-            </w:tcMar>
-          </w:tcPr>
-          <w:p wp14:textId="77777777">
-            <w:pPr>
-              <w:jc w:val="center"/>
-              <w:rPr>
-                <w:rFonts w:ascii="Times New Roman" w:hAnsi="Times New Roman" w:eastAsia="Times New Roman" w:cs="Times New Roman"/>
-                <w:b w:val="1"/>
-                <w:bCs w:val="1"/>
-                <w:color w:val="auto"/>
-                <w:sz w:val="22"/>
-                <w:szCs w:val="22"/>
-              </w:rPr>
-            </w:pPr>
-            <w:r>
-              <w:rPr>
-                <w:rFonts w:ascii="Times New Roman" w:hAnsi="Times New Roman" w:eastAsia="Times New Roman" w:cs="Times New Roman"/>
-                <w:b w:val="1"/>
-                <w:bCs w:val="1"/>
-                <w:color w:val="auto"/>
-                <w:sz w:val="22"/>
-                <w:szCs w:val="22"/>
-              </w:rPr>
-              <w:t>Main Script: Account Holder Input</w:t>
-            </w:r>
-          </w:p>
-        </w:tc>
-      </w:tr>
-      <w:tr xmlns:wp14="http://schemas.microsoft.com/office/word/2010/wordml" wp14:textId="77777777">
-        <w:tc>
-          <w:tcPr>
-            <w:tcW w:w="810" w:type="dxa"/>
-            <w:tcMar>
-              <w:top w:w="80" w:type="dxa"/>
-              <w:left w:w="150" w:type="dxa"/>
-              <w:bottom w:w="80" w:type="dxa"/>
-              <w:left w:w="150" w:type="dxa"/>
-              <w:right w:w="150" w:type="dxa"/>
-            </w:tcMar>
-          </w:tcPr>
-          <w:p wp14:textId="77777777">
-            <w:pPr>
-              <w:rPr>
-                <w:rFonts w:ascii="Times New Roman" w:hAnsi="Times New Roman" w:eastAsia="Times New Roman" w:cs="Times New Roman"/>
-                <w:color w:val="auto"/>
-                <w:sz w:val="22"/>
-                <w:szCs w:val="22"/>
-              </w:rPr>
-            </w:pPr>
-            <w:r>
-              <w:rPr>
-                <w:rFonts w:ascii="Times New Roman" w:hAnsi="Times New Roman" w:eastAsia="Times New Roman" w:cs="Times New Roman"/>
-                <w:color w:val="auto"/>
-                <w:sz w:val="22"/>
-                <w:szCs w:val="22"/>
-              </w:rPr>
-              <w:t>TC1</w:t>
-            </w:r>
-          </w:p>
-        </w:tc>
-        <w:tc>
-          <w:tcPr>
-            <w:tcW w:w="3720" w:type="dxa"/>
-            <w:tcMar>
-              <w:top w:w="80" w:type="dxa"/>
-              <w:left w:w="150" w:type="dxa"/>
-              <w:bottom w:w="80" w:type="dxa"/>
-              <w:left w:w="150" w:type="dxa"/>
-              <w:right w:w="150" w:type="dxa"/>
-            </w:tcMar>
-          </w:tcPr>
-          <w:p wp14:textId="77777777">
-            <w:pPr>
-              <w:rPr>
-                <w:rFonts w:ascii="Times New Roman" w:hAnsi="Times New Roman" w:eastAsia="Times New Roman" w:cs="Times New Roman"/>
-                <w:color w:val="auto"/>
-                <w:sz w:val="22"/>
-                <w:szCs w:val="22"/>
-              </w:rPr>
-            </w:pPr>
-            <w:r>
-              <w:rPr>
-                <w:rFonts w:ascii="Times New Roman" w:hAnsi="Times New Roman" w:eastAsia="Times New Roman" w:cs="Times New Roman"/>
-                <w:color w:val="auto"/>
-                <w:sz w:val="22"/>
-                <w:szCs w:val="22"/>
-              </w:rPr>
-              <w:t>straccHolder = ""</w:t>
-            </w:r>
-          </w:p>
-        </w:tc>
-        <w:tc>
-          <w:tcPr>
-            <w:tcW w:w="2490" w:type="dxa"/>
-            <w:tcMar>
-              <w:top w:w="80" w:type="dxa"/>
-              <w:left w:w="150" w:type="dxa"/>
-              <w:bottom w:w="80" w:type="dxa"/>
-              <w:left w:w="150" w:type="dxa"/>
-              <w:right w:w="150" w:type="dxa"/>
-            </w:tcMar>
-          </w:tcPr>
-          <w:p wp14:textId="77777777">
-            <w:pPr>
-              <w:jc w:val="center"/>
-              <w:rPr>
-                <w:rFonts w:ascii="Times New Roman" w:hAnsi="Times New Roman" w:eastAsia="Times New Roman" w:cs="Times New Roman"/>
-                <w:color w:val="auto"/>
-                <w:sz w:val="22"/>
-                <w:szCs w:val="22"/>
-              </w:rPr>
-            </w:pPr>
-            <w:r>
-              <w:rPr>
-                <w:rFonts w:ascii="Times New Roman" w:hAnsi="Times New Roman" w:eastAsia="Times New Roman" w:cs="Times New Roman"/>
-                <w:color w:val="auto"/>
-                <w:sz w:val="22"/>
-                <w:szCs w:val="22"/>
-              </w:rPr>
-              <w:t>33%</w:t>
-            </w:r>
-          </w:p>
-        </w:tc>
-        <w:tc>
-          <w:tcPr>
-            <w:tcW w:w="2445" w:type="dxa"/>
-            <w:tcMar>
-              <w:top w:w="80" w:type="dxa"/>
-              <w:left w:w="150" w:type="dxa"/>
-              <w:bottom w:w="80" w:type="dxa"/>
-              <w:left w:w="150" w:type="dxa"/>
-              <w:right w:w="150" w:type="dxa"/>
-            </w:tcMar>
-          </w:tcPr>
-          <w:p wp14:textId="77777777">
-            <w:pPr>
-              <w:jc w:val="center"/>
-              <w:rPr>
-                <w:rFonts w:ascii="Times New Roman" w:hAnsi="Times New Roman" w:eastAsia="Times New Roman" w:cs="Times New Roman"/>
-                <w:color w:val="auto"/>
-                <w:sz w:val="22"/>
-                <w:szCs w:val="22"/>
-              </w:rPr>
-            </w:pPr>
-            <w:r>
-              <w:rPr>
-                <w:rFonts w:ascii="Times New Roman" w:hAnsi="Times New Roman" w:eastAsia="Times New Roman" w:cs="Times New Roman"/>
-                <w:color w:val="auto"/>
-                <w:sz w:val="22"/>
-                <w:szCs w:val="22"/>
-              </w:rPr>
-              <w:t>33%</w:t>
-            </w:r>
-          </w:p>
-        </w:tc>
-      </w:tr>
-      <w:tr xmlns:wp14="http://schemas.microsoft.com/office/word/2010/wordml" wp14:textId="77777777">
-        <w:tc>
-          <w:tcPr>
-            <w:tcW w:w="810" w:type="dxa"/>
-            <w:tcMar>
-              <w:top w:w="80" w:type="dxa"/>
-              <w:left w:w="150" w:type="dxa"/>
-              <w:bottom w:w="80" w:type="dxa"/>
-              <w:left w:w="150" w:type="dxa"/>
-              <w:right w:w="150" w:type="dxa"/>
-            </w:tcMar>
-          </w:tcPr>
-          <w:p wp14:textId="77777777">
-            <w:pPr>
-              <w:rPr>
-                <w:rFonts w:ascii="Times New Roman" w:hAnsi="Times New Roman" w:eastAsia="Times New Roman" w:cs="Times New Roman"/>
-                <w:color w:val="auto"/>
-                <w:sz w:val="22"/>
-                <w:szCs w:val="22"/>
-              </w:rPr>
-            </w:pPr>
-            <w:r>
-              <w:rPr>
-                <w:rFonts w:ascii="Times New Roman" w:hAnsi="Times New Roman" w:eastAsia="Times New Roman" w:cs="Times New Roman"/>
-                <w:color w:val="auto"/>
-                <w:sz w:val="22"/>
-                <w:szCs w:val="22"/>
-              </w:rPr>
-              <w:t>TC2</w:t>
-            </w:r>
-          </w:p>
-        </w:tc>
-        <w:tc>
-          <w:tcPr>
-            <w:tcW w:w="3720" w:type="dxa"/>
-            <w:tcMar>
-              <w:top w:w="80" w:type="dxa"/>
-              <w:left w:w="150" w:type="dxa"/>
-              <w:bottom w:w="80" w:type="dxa"/>
-              <w:left w:w="150" w:type="dxa"/>
-              <w:right w:w="150" w:type="dxa"/>
-            </w:tcMar>
-          </w:tcPr>
-          <w:p wp14:textId="77777777">
-            <w:pPr>
-              <w:rPr>
-                <w:rFonts w:ascii="Times New Roman" w:hAnsi="Times New Roman" w:eastAsia="Times New Roman" w:cs="Times New Roman"/>
-                <w:color w:val="auto"/>
-                <w:sz w:val="22"/>
-                <w:szCs w:val="22"/>
-              </w:rPr>
-            </w:pPr>
-            <w:r>
-              <w:rPr>
-                <w:rFonts w:ascii="Times New Roman" w:hAnsi="Times New Roman" w:eastAsia="Times New Roman" w:cs="Times New Roman"/>
-                <w:color w:val="auto"/>
-                <w:sz w:val="22"/>
-                <w:szCs w:val="22"/>
-              </w:rPr>
-              <w:t>straccHolder = "12345"</w:t>
-            </w:r>
-          </w:p>
-        </w:tc>
-        <w:tc>
-          <w:tcPr>
-            <w:tcW w:w="2490" w:type="dxa"/>
-            <w:tcMar>
-              <w:top w:w="80" w:type="dxa"/>
-              <w:left w:w="150" w:type="dxa"/>
-              <w:bottom w:w="80" w:type="dxa"/>
-              <w:left w:w="150" w:type="dxa"/>
-              <w:right w:w="150" w:type="dxa"/>
-            </w:tcMar>
-          </w:tcPr>
-          <w:p wp14:textId="77777777">
-            <w:pPr>
-              <w:jc w:val="center"/>
-              <w:rPr>
-                <w:rFonts w:ascii="Times New Roman" w:hAnsi="Times New Roman" w:eastAsia="Times New Roman" w:cs="Times New Roman"/>
-                <w:color w:val="auto"/>
-                <w:sz w:val="22"/>
-                <w:szCs w:val="22"/>
-              </w:rPr>
-            </w:pPr>
-            <w:r>
-              <w:rPr>
-                <w:rFonts w:ascii="Times New Roman" w:hAnsi="Times New Roman" w:eastAsia="Times New Roman" w:cs="Times New Roman"/>
-                <w:color w:val="auto"/>
-                <w:sz w:val="22"/>
-                <w:szCs w:val="22"/>
-              </w:rPr>
-              <w:t>66%</w:t>
-            </w:r>
-          </w:p>
-        </w:tc>
-        <w:tc>
-          <w:tcPr>
-            <w:tcW w:w="2445" w:type="dxa"/>
-            <w:tcMar>
-              <w:top w:w="80" w:type="dxa"/>
-              <w:left w:w="150" w:type="dxa"/>
-              <w:bottom w:w="80" w:type="dxa"/>
-              <w:left w:w="150" w:type="dxa"/>
-              <w:right w:w="150" w:type="dxa"/>
-            </w:tcMar>
-          </w:tcPr>
-          <w:p wp14:textId="77777777">
-            <w:pPr>
-              <w:jc w:val="center"/>
-              <w:rPr>
-                <w:rFonts w:ascii="Times New Roman" w:hAnsi="Times New Roman" w:eastAsia="Times New Roman" w:cs="Times New Roman"/>
-                <w:color w:val="auto"/>
-                <w:sz w:val="22"/>
-                <w:szCs w:val="22"/>
-              </w:rPr>
-            </w:pPr>
-            <w:r>
-              <w:rPr>
-                <w:rFonts w:ascii="Times New Roman" w:hAnsi="Times New Roman" w:eastAsia="Times New Roman" w:cs="Times New Roman"/>
-                <w:color w:val="auto"/>
-                <w:sz w:val="22"/>
-                <w:szCs w:val="22"/>
-              </w:rPr>
-              <w:t>66%</w:t>
-            </w:r>
-          </w:p>
-        </w:tc>
-      </w:tr>
-      <w:tr xmlns:wp14="http://schemas.microsoft.com/office/word/2010/wordml" wp14:textId="77777777">
-        <w:tc>
-          <w:tcPr>
-            <w:tcW w:w="810" w:type="dxa"/>
-            <w:tcMar>
-              <w:top w:w="80" w:type="dxa"/>
-              <w:left w:w="150" w:type="dxa"/>
-              <w:bottom w:w="80" w:type="dxa"/>
-              <w:left w:w="150" w:type="dxa"/>
-              <w:right w:w="150" w:type="dxa"/>
-            </w:tcMar>
-          </w:tcPr>
-          <w:p wp14:textId="77777777">
-            <w:pPr>
-              <w:rPr>
-                <w:rFonts w:ascii="Times New Roman" w:hAnsi="Times New Roman" w:eastAsia="Times New Roman" w:cs="Times New Roman"/>
-                <w:color w:val="auto"/>
-                <w:sz w:val="22"/>
-                <w:szCs w:val="22"/>
-              </w:rPr>
-            </w:pPr>
-            <w:r>
-              <w:rPr>
-                <w:rFonts w:ascii="Times New Roman" w:hAnsi="Times New Roman" w:eastAsia="Times New Roman" w:cs="Times New Roman"/>
-                <w:color w:val="auto"/>
-                <w:sz w:val="22"/>
-                <w:szCs w:val="22"/>
-              </w:rPr>
-              <w:t>TC3</w:t>
-            </w:r>
-          </w:p>
-        </w:tc>
-        <w:tc>
-          <w:tcPr>
-            <w:tcW w:w="3720" w:type="dxa"/>
-            <w:tcMar>
-              <w:top w:w="80" w:type="dxa"/>
-              <w:left w:w="150" w:type="dxa"/>
-              <w:bottom w:w="80" w:type="dxa"/>
-              <w:left w:w="150" w:type="dxa"/>
-              <w:right w:w="150" w:type="dxa"/>
-            </w:tcMar>
-          </w:tcPr>
-          <w:p wp14:textId="77777777">
-            <w:pPr>
-              <w:rPr>
-                <w:rFonts w:ascii="Times New Roman" w:hAnsi="Times New Roman" w:eastAsia="Times New Roman" w:cs="Times New Roman"/>
-                <w:color w:val="auto"/>
-                <w:sz w:val="22"/>
-                <w:szCs w:val="22"/>
-              </w:rPr>
-            </w:pPr>
-            <w:r>
-              <w:rPr>
-                <w:rFonts w:ascii="Times New Roman" w:hAnsi="Times New Roman" w:eastAsia="Times New Roman" w:cs="Times New Roman"/>
-                <w:color w:val="auto"/>
-                <w:sz w:val="22"/>
-                <w:szCs w:val="22"/>
-              </w:rPr>
-              <w:t>straccHolder = "Sipho Sehlapelo"</w:t>
-            </w:r>
-          </w:p>
-        </w:tc>
-        <w:tc>
-          <w:tcPr>
-            <w:tcW w:w="2490" w:type="dxa"/>
-            <w:tcMar>
-              <w:top w:w="80" w:type="dxa"/>
-              <w:left w:w="150" w:type="dxa"/>
-              <w:bottom w:w="80" w:type="dxa"/>
-              <w:left w:w="150" w:type="dxa"/>
-              <w:right w:w="150" w:type="dxa"/>
-            </w:tcMar>
-          </w:tcPr>
-          <w:p wp14:textId="77777777">
-            <w:pPr>
-              <w:jc w:val="center"/>
-              <w:rPr>
-                <w:rFonts w:ascii="Times New Roman" w:hAnsi="Times New Roman" w:eastAsia="Times New Roman" w:cs="Times New Roman"/>
-                <w:color w:val="auto"/>
-                <w:sz w:val="22"/>
-                <w:szCs w:val="22"/>
-              </w:rPr>
-            </w:pPr>
-            <w:r>
-              <w:rPr>
-                <w:rFonts w:ascii="Times New Roman" w:hAnsi="Times New Roman" w:eastAsia="Times New Roman" w:cs="Times New Roman"/>
-                <w:color w:val="auto"/>
-                <w:sz w:val="22"/>
-                <w:szCs w:val="22"/>
-              </w:rPr>
-              <w:t>100%</w:t>
-            </w:r>
-          </w:p>
-        </w:tc>
-        <w:tc>
-          <w:tcPr>
-            <w:tcW w:w="2445" w:type="dxa"/>
-            <w:tcMar>
-              <w:top w:w="80" w:type="dxa"/>
-              <w:left w:w="150" w:type="dxa"/>
-              <w:bottom w:w="80" w:type="dxa"/>
-              <w:left w:w="150" w:type="dxa"/>
-              <w:right w:w="150" w:type="dxa"/>
-            </w:tcMar>
-          </w:tcPr>
-          <w:p wp14:textId="77777777">
-            <w:pPr>
-              <w:jc w:val="center"/>
-              <w:rPr>
-                <w:rFonts w:ascii="Times New Roman" w:hAnsi="Times New Roman" w:eastAsia="Times New Roman" w:cs="Times New Roman"/>
-                <w:color w:val="auto"/>
-                <w:sz w:val="22"/>
-                <w:szCs w:val="22"/>
-              </w:rPr>
-            </w:pPr>
-            <w:r>
-              <w:rPr>
-                <w:rFonts w:ascii="Times New Roman" w:hAnsi="Times New Roman" w:eastAsia="Times New Roman" w:cs="Times New Roman"/>
-                <w:color w:val="auto"/>
-                <w:sz w:val="22"/>
-                <w:szCs w:val="22"/>
-              </w:rPr>
-              <w:t>100%</w:t>
-            </w:r>
-          </w:p>
-        </w:tc>
-      </w:tr>
-      <w:tr xmlns:wp14="http://schemas.microsoft.com/office/word/2010/wordml" wp14:textId="77777777">
-        <w:tc>
-          <w:tcPr>
-            <w:tcW w:w="9465" w:type="dxa"/>
-            <w:gridSpan w:val="4"/>
-            <w:shd w:val="clear" w:color="auto" w:fill="D9D9D9" w:themeFill="background1" w:themeFillShade="D9"/>
-            <w:tcMar>
-              <w:top w:w="100" w:type="dxa"/>
-              <w:left w:w="150" w:type="dxa"/>
-              <w:bottom w:w="100" w:type="dxa"/>
-              <w:left w:w="150" w:type="dxa"/>
-              <w:right w:w="150" w:type="dxa"/>
-            </w:tcMar>
-          </w:tcPr>
-          <w:p wp14:textId="77777777">
-            <w:pPr>
-              <w:jc w:val="center"/>
-              <w:rPr>
-                <w:rFonts w:ascii="Times New Roman" w:hAnsi="Times New Roman" w:eastAsia="Times New Roman" w:cs="Times New Roman"/>
-                <w:b w:val="1"/>
-                <w:bCs w:val="1"/>
-                <w:color w:val="auto"/>
-                <w:sz w:val="22"/>
-                <w:szCs w:val="22"/>
-              </w:rPr>
-            </w:pPr>
-            <w:r>
-              <w:rPr>
-                <w:rFonts w:ascii="Times New Roman" w:hAnsi="Times New Roman" w:eastAsia="Times New Roman" w:cs="Times New Roman"/>
-                <w:b w:val="1"/>
-                <w:bCs w:val="1"/>
-                <w:color w:val="auto"/>
-                <w:sz w:val="22"/>
-                <w:szCs w:val="22"/>
-              </w:rPr>
-              <w:t>Main Script: Menu Selection &amp; Navigation</w:t>
-            </w:r>
-          </w:p>
-        </w:tc>
-      </w:tr>
-      <w:tr xmlns:wp14="http://schemas.microsoft.com/office/word/2010/wordml" wp14:textId="77777777">
-        <w:tc>
-          <w:tcPr>
-            <w:tcW w:w="810" w:type="dxa"/>
-            <w:tcMar>
-              <w:top w:w="80" w:type="dxa"/>
-              <w:left w:w="150" w:type="dxa"/>
-              <w:bottom w:w="80" w:type="dxa"/>
-              <w:left w:w="150" w:type="dxa"/>
-              <w:right w:w="150" w:type="dxa"/>
-            </w:tcMar>
-          </w:tcPr>
-          <w:p wp14:textId="77777777">
-            <w:pPr>
-              <w:rPr>
-                <w:rFonts w:ascii="Times New Roman" w:hAnsi="Times New Roman" w:eastAsia="Times New Roman" w:cs="Times New Roman"/>
-                <w:color w:val="auto"/>
-                <w:sz w:val="22"/>
-                <w:szCs w:val="22"/>
-              </w:rPr>
-            </w:pPr>
-            <w:r>
-              <w:rPr>
-                <w:rFonts w:ascii="Times New Roman" w:hAnsi="Times New Roman" w:eastAsia="Times New Roman" w:cs="Times New Roman"/>
-                <w:color w:val="auto"/>
-                <w:sz w:val="22"/>
-                <w:szCs w:val="22"/>
-              </w:rPr>
-              <w:t>TC1</w:t>
-            </w:r>
-          </w:p>
-        </w:tc>
-        <w:tc>
-          <w:tcPr>
-            <w:tcW w:w="3720" w:type="dxa"/>
-            <w:tcMar>
-              <w:top w:w="80" w:type="dxa"/>
-              <w:left w:w="150" w:type="dxa"/>
-              <w:bottom w:w="80" w:type="dxa"/>
-              <w:left w:w="150" w:type="dxa"/>
-              <w:right w:w="150" w:type="dxa"/>
-            </w:tcMar>
-          </w:tcPr>
-          <w:p wp14:textId="77777777">
-            <w:pPr>
-              <w:rPr>
-                <w:rFonts w:ascii="Times New Roman" w:hAnsi="Times New Roman" w:eastAsia="Times New Roman" w:cs="Times New Roman"/>
-                <w:color w:val="auto"/>
-                <w:sz w:val="22"/>
-                <w:szCs w:val="22"/>
-              </w:rPr>
-            </w:pPr>
-            <w:r>
-              <w:rPr>
-                <w:rFonts w:ascii="Times New Roman" w:hAnsi="Times New Roman" w:eastAsia="Times New Roman" w:cs="Times New Roman"/>
-                <w:color w:val="auto"/>
-                <w:sz w:val="22"/>
-                <w:szCs w:val="22"/>
-              </w:rPr>
-              <w:t>strSelection = "abc"</w:t>
-            </w:r>
-          </w:p>
-        </w:tc>
-        <w:tc>
-          <w:tcPr>
-            <w:tcW w:w="2490" w:type="dxa"/>
-            <w:tcMar>
-              <w:top w:w="80" w:type="dxa"/>
-              <w:left w:w="150" w:type="dxa"/>
-              <w:bottom w:w="80" w:type="dxa"/>
-              <w:left w:w="150" w:type="dxa"/>
-              <w:right w:w="150" w:type="dxa"/>
-            </w:tcMar>
-          </w:tcPr>
-          <w:p wp14:textId="77777777">
-            <w:pPr>
-              <w:jc w:val="center"/>
-              <w:rPr>
-                <w:rFonts w:ascii="Times New Roman" w:hAnsi="Times New Roman" w:eastAsia="Times New Roman" w:cs="Times New Roman"/>
-                <w:color w:val="auto"/>
-                <w:sz w:val="22"/>
-                <w:szCs w:val="22"/>
-              </w:rPr>
-            </w:pPr>
-            <w:r>
-              <w:rPr>
-                <w:rFonts w:ascii="Times New Roman" w:hAnsi="Times New Roman" w:eastAsia="Times New Roman" w:cs="Times New Roman"/>
-                <w:color w:val="auto"/>
-                <w:sz w:val="22"/>
-                <w:szCs w:val="22"/>
-              </w:rPr>
-              <w:t>20%</w:t>
-            </w:r>
-          </w:p>
-        </w:tc>
-        <w:tc>
-          <w:tcPr>
-            <w:tcW w:w="2445" w:type="dxa"/>
-            <w:tcMar>
-              <w:top w:w="80" w:type="dxa"/>
-              <w:left w:w="150" w:type="dxa"/>
-              <w:bottom w:w="80" w:type="dxa"/>
-              <w:left w:w="150" w:type="dxa"/>
-              <w:right w:w="150" w:type="dxa"/>
-            </w:tcMar>
-          </w:tcPr>
-          <w:p wp14:textId="77777777">
-            <w:pPr>
-              <w:jc w:val="center"/>
-              <w:rPr>
-                <w:rFonts w:ascii="Times New Roman" w:hAnsi="Times New Roman" w:eastAsia="Times New Roman" w:cs="Times New Roman"/>
-                <w:color w:val="auto"/>
-                <w:sz w:val="22"/>
-                <w:szCs w:val="22"/>
-              </w:rPr>
-            </w:pPr>
-            <w:r>
-              <w:rPr>
-                <w:rFonts w:ascii="Times New Roman" w:hAnsi="Times New Roman" w:eastAsia="Times New Roman" w:cs="Times New Roman"/>
-                <w:color w:val="auto"/>
-                <w:sz w:val="22"/>
-                <w:szCs w:val="22"/>
-              </w:rPr>
-              <w:t>15%</w:t>
-            </w:r>
-          </w:p>
-        </w:tc>
-      </w:tr>
-      <w:tr xmlns:wp14="http://schemas.microsoft.com/office/word/2010/wordml" wp14:textId="77777777">
-        <w:tc>
-          <w:tcPr>
-            <w:tcW w:w="810" w:type="dxa"/>
-            <w:tcMar>
-              <w:top w:w="80" w:type="dxa"/>
-              <w:left w:w="150" w:type="dxa"/>
-              <w:bottom w:w="80" w:type="dxa"/>
-              <w:left w:w="150" w:type="dxa"/>
-              <w:right w:w="150" w:type="dxa"/>
-            </w:tcMar>
-          </w:tcPr>
-          <w:p wp14:textId="77777777">
-            <w:pPr>
-              <w:rPr>
-                <w:rFonts w:ascii="Times New Roman" w:hAnsi="Times New Roman" w:eastAsia="Times New Roman" w:cs="Times New Roman"/>
-                <w:color w:val="auto"/>
-                <w:sz w:val="22"/>
-                <w:szCs w:val="22"/>
-              </w:rPr>
-            </w:pPr>
-            <w:r>
-              <w:rPr>
-                <w:rFonts w:ascii="Times New Roman" w:hAnsi="Times New Roman" w:eastAsia="Times New Roman" w:cs="Times New Roman"/>
-                <w:color w:val="auto"/>
-                <w:sz w:val="22"/>
-                <w:szCs w:val="22"/>
-              </w:rPr>
-              <w:t>TC2</w:t>
-            </w:r>
-          </w:p>
-        </w:tc>
-        <w:tc>
-          <w:tcPr>
-            <w:tcW w:w="3720" w:type="dxa"/>
-            <w:tcMar>
-              <w:top w:w="80" w:type="dxa"/>
-              <w:left w:w="150" w:type="dxa"/>
-              <w:bottom w:w="80" w:type="dxa"/>
-              <w:left w:w="150" w:type="dxa"/>
-              <w:right w:w="150" w:type="dxa"/>
-            </w:tcMar>
-          </w:tcPr>
-          <w:p wp14:textId="77777777">
-            <w:pPr>
-              <w:rPr>
-                <w:rFonts w:ascii="Times New Roman" w:hAnsi="Times New Roman" w:eastAsia="Times New Roman" w:cs="Times New Roman"/>
-                <w:color w:val="auto"/>
-                <w:sz w:val="22"/>
-                <w:szCs w:val="22"/>
-              </w:rPr>
-            </w:pPr>
-            <w:r>
-              <w:rPr>
-                <w:rFonts w:ascii="Times New Roman" w:hAnsi="Times New Roman" w:eastAsia="Times New Roman" w:cs="Times New Roman"/>
-                <w:color w:val="auto"/>
-                <w:sz w:val="22"/>
-                <w:szCs w:val="22"/>
-              </w:rPr>
-              <w:t>strSelection = "99"</w:t>
-            </w:r>
-          </w:p>
-        </w:tc>
-        <w:tc>
-          <w:tcPr>
-            <w:tcW w:w="2490" w:type="dxa"/>
-            <w:tcMar>
-              <w:top w:w="80" w:type="dxa"/>
-              <w:left w:w="150" w:type="dxa"/>
-              <w:bottom w:w="80" w:type="dxa"/>
-              <w:left w:w="150" w:type="dxa"/>
-              <w:right w:w="150" w:type="dxa"/>
-            </w:tcMar>
-          </w:tcPr>
-          <w:p wp14:textId="77777777">
-            <w:pPr>
-              <w:jc w:val="center"/>
-              <w:rPr>
-                <w:rFonts w:ascii="Times New Roman" w:hAnsi="Times New Roman" w:eastAsia="Times New Roman" w:cs="Times New Roman"/>
-                <w:color w:val="auto"/>
-                <w:sz w:val="22"/>
-                <w:szCs w:val="22"/>
-              </w:rPr>
-            </w:pPr>
-            <w:r>
-              <w:rPr>
-                <w:rFonts w:ascii="Times New Roman" w:hAnsi="Times New Roman" w:eastAsia="Times New Roman" w:cs="Times New Roman"/>
-                <w:color w:val="auto"/>
-                <w:sz w:val="22"/>
-                <w:szCs w:val="22"/>
-              </w:rPr>
-              <w:t>40%</w:t>
-            </w:r>
-          </w:p>
-        </w:tc>
-        <w:tc>
-          <w:tcPr>
-            <w:tcW w:w="2445" w:type="dxa"/>
-            <w:tcMar>
-              <w:top w:w="80" w:type="dxa"/>
-              <w:left w:w="150" w:type="dxa"/>
-              <w:bottom w:w="80" w:type="dxa"/>
-              <w:left w:w="150" w:type="dxa"/>
-              <w:right w:w="150" w:type="dxa"/>
-            </w:tcMar>
-          </w:tcPr>
-          <w:p wp14:textId="77777777">
-            <w:pPr>
-              <w:jc w:val="center"/>
-              <w:rPr>
-                <w:rFonts w:ascii="Times New Roman" w:hAnsi="Times New Roman" w:eastAsia="Times New Roman" w:cs="Times New Roman"/>
-                <w:color w:val="auto"/>
-                <w:sz w:val="22"/>
-                <w:szCs w:val="22"/>
-              </w:rPr>
-            </w:pPr>
-            <w:r>
-              <w:rPr>
-                <w:rFonts w:ascii="Times New Roman" w:hAnsi="Times New Roman" w:eastAsia="Times New Roman" w:cs="Times New Roman"/>
-                <w:color w:val="auto"/>
-                <w:sz w:val="22"/>
-                <w:szCs w:val="22"/>
-              </w:rPr>
-              <w:t>30%</w:t>
-            </w:r>
-          </w:p>
-        </w:tc>
-      </w:tr>
-      <w:tr xmlns:wp14="http://schemas.microsoft.com/office/word/2010/wordml" wp14:textId="77777777">
-        <w:tc>
-          <w:tcPr>
-            <w:tcW w:w="810" w:type="dxa"/>
-            <w:tcMar>
-              <w:top w:w="80" w:type="dxa"/>
-              <w:left w:w="150" w:type="dxa"/>
-              <w:bottom w:w="80" w:type="dxa"/>
-              <w:left w:w="150" w:type="dxa"/>
-              <w:right w:w="150" w:type="dxa"/>
-            </w:tcMar>
-          </w:tcPr>
-          <w:p wp14:textId="77777777">
-            <w:pPr>
-              <w:rPr>
-                <w:rFonts w:ascii="Times New Roman" w:hAnsi="Times New Roman" w:eastAsia="Times New Roman" w:cs="Times New Roman"/>
-                <w:color w:val="auto"/>
-                <w:sz w:val="22"/>
-                <w:szCs w:val="22"/>
-              </w:rPr>
-            </w:pPr>
-            <w:r>
-              <w:rPr>
-                <w:rFonts w:ascii="Times New Roman" w:hAnsi="Times New Roman" w:eastAsia="Times New Roman" w:cs="Times New Roman"/>
-                <w:color w:val="auto"/>
-                <w:sz w:val="22"/>
-                <w:szCs w:val="22"/>
-              </w:rPr>
-              <w:t>TC3</w:t>
-            </w:r>
-          </w:p>
-        </w:tc>
-        <w:tc>
-          <w:tcPr>
-            <w:tcW w:w="3720" w:type="dxa"/>
-            <w:tcMar>
-              <w:top w:w="80" w:type="dxa"/>
-              <w:left w:w="150" w:type="dxa"/>
-              <w:bottom w:w="80" w:type="dxa"/>
-              <w:left w:w="150" w:type="dxa"/>
-              <w:right w:w="150" w:type="dxa"/>
-            </w:tcMar>
-          </w:tcPr>
-          <w:p wp14:textId="77777777">
-            <w:pPr>
-              <w:rPr>
-                <w:rFonts w:ascii="Times New Roman" w:hAnsi="Times New Roman" w:eastAsia="Times New Roman" w:cs="Times New Roman"/>
-                <w:color w:val="auto"/>
-                <w:sz w:val="22"/>
-                <w:szCs w:val="22"/>
-              </w:rPr>
-            </w:pPr>
-            <w:r>
-              <w:rPr>
-                <w:rFonts w:ascii="Times New Roman" w:hAnsi="Times New Roman" w:eastAsia="Times New Roman" w:cs="Times New Roman"/>
-                <w:color w:val="auto"/>
-                <w:sz w:val="22"/>
-                <w:szCs w:val="22"/>
-              </w:rPr>
-              <w:t>strSelection = "1", dblwithdrawalamount = ""</w:t>
-            </w:r>
-          </w:p>
-        </w:tc>
-        <w:tc>
-          <w:tcPr>
-            <w:tcW w:w="2490" w:type="dxa"/>
-            <w:tcMar>
-              <w:top w:w="80" w:type="dxa"/>
-              <w:left w:w="150" w:type="dxa"/>
-              <w:bottom w:w="80" w:type="dxa"/>
-              <w:left w:w="150" w:type="dxa"/>
-              <w:right w:w="150" w:type="dxa"/>
-            </w:tcMar>
-          </w:tcPr>
-          <w:p wp14:textId="77777777">
-            <w:pPr>
-              <w:jc w:val="center"/>
-              <w:rPr>
-                <w:rFonts w:ascii="Times New Roman" w:hAnsi="Times New Roman" w:eastAsia="Times New Roman" w:cs="Times New Roman"/>
-                <w:color w:val="auto"/>
-                <w:sz w:val="22"/>
-                <w:szCs w:val="22"/>
-              </w:rPr>
-            </w:pPr>
-            <w:r>
-              <w:rPr>
-                <w:rFonts w:ascii="Times New Roman" w:hAnsi="Times New Roman" w:eastAsia="Times New Roman" w:cs="Times New Roman"/>
-                <w:color w:val="auto"/>
-                <w:sz w:val="22"/>
-                <w:szCs w:val="22"/>
-              </w:rPr>
-              <w:t>60%</w:t>
-            </w:r>
-          </w:p>
-        </w:tc>
-        <w:tc>
-          <w:tcPr>
-            <w:tcW w:w="2445" w:type="dxa"/>
-            <w:tcMar>
-              <w:top w:w="80" w:type="dxa"/>
-              <w:left w:w="150" w:type="dxa"/>
-              <w:bottom w:w="80" w:type="dxa"/>
-              <w:left w:w="150" w:type="dxa"/>
-              <w:right w:w="150" w:type="dxa"/>
-            </w:tcMar>
-          </w:tcPr>
-          <w:p wp14:textId="77777777">
-            <w:pPr>
-              <w:jc w:val="center"/>
-              <w:rPr>
-                <w:rFonts w:ascii="Times New Roman" w:hAnsi="Times New Roman" w:eastAsia="Times New Roman" w:cs="Times New Roman"/>
-                <w:color w:val="auto"/>
-                <w:sz w:val="22"/>
-                <w:szCs w:val="22"/>
-              </w:rPr>
-            </w:pPr>
-            <w:r>
-              <w:rPr>
-                <w:rFonts w:ascii="Times New Roman" w:hAnsi="Times New Roman" w:eastAsia="Times New Roman" w:cs="Times New Roman"/>
-                <w:color w:val="auto"/>
-                <w:sz w:val="22"/>
-                <w:szCs w:val="22"/>
-              </w:rPr>
-              <w:t>50%</w:t>
-            </w:r>
-          </w:p>
-        </w:tc>
-      </w:tr>
-      <w:tr xmlns:wp14="http://schemas.microsoft.com/office/word/2010/wordml" wp14:textId="77777777">
-        <w:tc>
-          <w:tcPr>
-            <w:tcW w:w="810" w:type="dxa"/>
-            <w:tcMar>
-              <w:top w:w="80" w:type="dxa"/>
-              <w:left w:w="150" w:type="dxa"/>
-              <w:bottom w:w="80" w:type="dxa"/>
-              <w:left w:w="150" w:type="dxa"/>
-              <w:right w:w="150" w:type="dxa"/>
-            </w:tcMar>
-          </w:tcPr>
-          <w:p wp14:textId="77777777">
-            <w:pPr>
-              <w:rPr>
-                <w:rFonts w:ascii="Times New Roman" w:hAnsi="Times New Roman" w:eastAsia="Times New Roman" w:cs="Times New Roman"/>
-                <w:color w:val="auto"/>
-                <w:sz w:val="22"/>
-                <w:szCs w:val="22"/>
-              </w:rPr>
-            </w:pPr>
-            <w:r>
-              <w:rPr>
-                <w:rFonts w:ascii="Times New Roman" w:hAnsi="Times New Roman" w:eastAsia="Times New Roman" w:cs="Times New Roman"/>
-                <w:color w:val="auto"/>
-                <w:sz w:val="22"/>
-                <w:szCs w:val="22"/>
-              </w:rPr>
-              <w:t>TC4</w:t>
-            </w:r>
-          </w:p>
-        </w:tc>
-        <w:tc>
-          <w:tcPr>
-            <w:tcW w:w="3720" w:type="dxa"/>
-            <w:tcMar>
-              <w:top w:w="80" w:type="dxa"/>
-              <w:left w:w="150" w:type="dxa"/>
-              <w:bottom w:w="80" w:type="dxa"/>
-              <w:left w:w="150" w:type="dxa"/>
-              <w:right w:w="150" w:type="dxa"/>
-            </w:tcMar>
-          </w:tcPr>
-          <w:p wp14:textId="77777777">
-            <w:pPr>
-              <w:rPr>
-                <w:rFonts w:ascii="Times New Roman" w:hAnsi="Times New Roman" w:eastAsia="Times New Roman" w:cs="Times New Roman"/>
-                <w:color w:val="auto"/>
-                <w:sz w:val="22"/>
-                <w:szCs w:val="22"/>
-              </w:rPr>
-            </w:pPr>
-            <w:r>
-              <w:rPr>
-                <w:rFonts w:ascii="Times New Roman" w:hAnsi="Times New Roman" w:eastAsia="Times New Roman" w:cs="Times New Roman"/>
-                <w:color w:val="auto"/>
-                <w:sz w:val="22"/>
-                <w:szCs w:val="22"/>
-              </w:rPr>
-              <w:t>strSelection = "1", dblwithdrawalamount = "abc"</w:t>
-            </w:r>
-          </w:p>
-        </w:tc>
-        <w:tc>
-          <w:tcPr>
-            <w:tcW w:w="2490" w:type="dxa"/>
-            <w:tcMar>
-              <w:top w:w="80" w:type="dxa"/>
-              <w:left w:w="150" w:type="dxa"/>
-              <w:bottom w:w="80" w:type="dxa"/>
-              <w:left w:w="150" w:type="dxa"/>
-              <w:right w:w="150" w:type="dxa"/>
-            </w:tcMar>
-          </w:tcPr>
-          <w:p wp14:textId="77777777">
-            <w:pPr>
-              <w:jc w:val="center"/>
-              <w:rPr>
-                <w:rFonts w:ascii="Times New Roman" w:hAnsi="Times New Roman" w:eastAsia="Times New Roman" w:cs="Times New Roman"/>
-                <w:color w:val="auto"/>
-                <w:sz w:val="22"/>
-                <w:szCs w:val="22"/>
-              </w:rPr>
-            </w:pPr>
-            <w:r>
-              <w:rPr>
-                <w:rFonts w:ascii="Times New Roman" w:hAnsi="Times New Roman" w:eastAsia="Times New Roman" w:cs="Times New Roman"/>
-                <w:color w:val="auto"/>
-                <w:sz w:val="22"/>
-                <w:szCs w:val="22"/>
-              </w:rPr>
-              <w:t>80%</w:t>
-            </w:r>
-          </w:p>
-        </w:tc>
-        <w:tc>
-          <w:tcPr>
-            <w:tcW w:w="2445" w:type="dxa"/>
-            <w:tcMar>
-              <w:top w:w="80" w:type="dxa"/>
-              <w:left w:w="150" w:type="dxa"/>
-              <w:bottom w:w="80" w:type="dxa"/>
-              <w:left w:w="150" w:type="dxa"/>
-              <w:right w:w="150" w:type="dxa"/>
-            </w:tcMar>
-          </w:tcPr>
-          <w:p wp14:textId="77777777">
-            <w:pPr>
-              <w:jc w:val="center"/>
-              <w:rPr>
-                <w:rFonts w:ascii="Times New Roman" w:hAnsi="Times New Roman" w:eastAsia="Times New Roman" w:cs="Times New Roman"/>
-                <w:color w:val="auto"/>
-                <w:sz w:val="22"/>
-                <w:szCs w:val="22"/>
-              </w:rPr>
-            </w:pPr>
-            <w:r>
-              <w:rPr>
-                <w:rFonts w:ascii="Times New Roman" w:hAnsi="Times New Roman" w:eastAsia="Times New Roman" w:cs="Times New Roman"/>
-                <w:color w:val="auto"/>
-                <w:sz w:val="22"/>
-                <w:szCs w:val="22"/>
-              </w:rPr>
-              <w:t>75%</w:t>
-            </w:r>
-          </w:p>
-        </w:tc>
-      </w:tr>
-      <w:tr xmlns:wp14="http://schemas.microsoft.com/office/word/2010/wordml" wp14:textId="77777777">
-        <w:tc>
-          <w:tcPr>
-            <w:tcW w:w="810" w:type="dxa"/>
-            <w:tcMar>
-              <w:top w:w="80" w:type="dxa"/>
-              <w:left w:w="150" w:type="dxa"/>
-              <w:bottom w:w="80" w:type="dxa"/>
-              <w:left w:w="150" w:type="dxa"/>
-              <w:right w:w="150" w:type="dxa"/>
-            </w:tcMar>
-          </w:tcPr>
-          <w:p wp14:textId="77777777">
-            <w:pPr>
-              <w:rPr>
-                <w:rFonts w:ascii="Times New Roman" w:hAnsi="Times New Roman" w:eastAsia="Times New Roman" w:cs="Times New Roman"/>
-                <w:color w:val="auto"/>
-                <w:sz w:val="22"/>
-                <w:szCs w:val="22"/>
-              </w:rPr>
-            </w:pPr>
-            <w:r>
-              <w:rPr>
-                <w:rFonts w:ascii="Times New Roman" w:hAnsi="Times New Roman" w:eastAsia="Times New Roman" w:cs="Times New Roman"/>
-                <w:color w:val="auto"/>
-                <w:sz w:val="22"/>
-                <w:szCs w:val="22"/>
-              </w:rPr>
-              <w:t>TC5</w:t>
-            </w:r>
-          </w:p>
-        </w:tc>
-        <w:tc>
-          <w:tcPr>
-            <w:tcW w:w="3720" w:type="dxa"/>
-            <w:tcMar>
-              <w:top w:w="80" w:type="dxa"/>
-              <w:left w:w="150" w:type="dxa"/>
-              <w:bottom w:w="80" w:type="dxa"/>
-              <w:left w:w="150" w:type="dxa"/>
-              <w:right w:w="150" w:type="dxa"/>
-            </w:tcMar>
-          </w:tcPr>
-          <w:p wp14:textId="77777777">
-            <w:pPr>
-              <w:rPr>
-                <w:rFonts w:ascii="Times New Roman" w:hAnsi="Times New Roman" w:eastAsia="Times New Roman" w:cs="Times New Roman"/>
-                <w:color w:val="auto"/>
-                <w:sz w:val="22"/>
-                <w:szCs w:val="22"/>
-              </w:rPr>
-            </w:pPr>
-            <w:r>
-              <w:rPr>
-                <w:rFonts w:ascii="Times New Roman" w:hAnsi="Times New Roman" w:eastAsia="Times New Roman" w:cs="Times New Roman"/>
-                <w:color w:val="auto"/>
-                <w:sz w:val="22"/>
-                <w:szCs w:val="22"/>
-              </w:rPr>
-              <w:t>strSelection = "1", dblwithdrawalamount = "200"</w:t>
-            </w:r>
-          </w:p>
-        </w:tc>
-        <w:tc>
-          <w:tcPr>
-            <w:tcW w:w="2490" w:type="dxa"/>
-            <w:tcMar>
-              <w:top w:w="80" w:type="dxa"/>
-              <w:left w:w="150" w:type="dxa"/>
-              <w:bottom w:w="80" w:type="dxa"/>
-              <w:left w:w="150" w:type="dxa"/>
-              <w:right w:w="150" w:type="dxa"/>
-            </w:tcMar>
-          </w:tcPr>
-          <w:p wp14:textId="77777777">
-            <w:pPr>
-              <w:jc w:val="center"/>
-              <w:rPr>
-                <w:rFonts w:ascii="Times New Roman" w:hAnsi="Times New Roman" w:eastAsia="Times New Roman" w:cs="Times New Roman"/>
-                <w:color w:val="auto"/>
-                <w:sz w:val="22"/>
-                <w:szCs w:val="22"/>
-              </w:rPr>
-            </w:pPr>
-            <w:r>
-              <w:rPr>
-                <w:rFonts w:ascii="Times New Roman" w:hAnsi="Times New Roman" w:eastAsia="Times New Roman" w:cs="Times New Roman"/>
-                <w:color w:val="auto"/>
-                <w:sz w:val="22"/>
-                <w:szCs w:val="22"/>
-              </w:rPr>
-              <w:t>100%</w:t>
-            </w:r>
-          </w:p>
-        </w:tc>
-        <w:tc>
-          <w:tcPr>
-            <w:tcW w:w="2445" w:type="dxa"/>
-            <w:tcMar>
-              <w:top w:w="80" w:type="dxa"/>
-              <w:left w:w="150" w:type="dxa"/>
-              <w:bottom w:w="80" w:type="dxa"/>
-              <w:left w:w="150" w:type="dxa"/>
-              <w:right w:w="150" w:type="dxa"/>
-            </w:tcMar>
-          </w:tcPr>
-          <w:p wp14:textId="77777777">
-            <w:pPr>
-              <w:jc w:val="center"/>
-              <w:rPr>
-                <w:rFonts w:ascii="Times New Roman" w:hAnsi="Times New Roman" w:eastAsia="Times New Roman" w:cs="Times New Roman"/>
-                <w:color w:val="auto"/>
-                <w:sz w:val="22"/>
-                <w:szCs w:val="22"/>
-              </w:rPr>
-            </w:pPr>
-            <w:r>
-              <w:rPr>
-                <w:rFonts w:ascii="Times New Roman" w:hAnsi="Times New Roman" w:eastAsia="Times New Roman" w:cs="Times New Roman"/>
-                <w:color w:val="auto"/>
-                <w:sz w:val="22"/>
-                <w:szCs w:val="22"/>
-              </w:rPr>
-              <w:t>100%</w:t>
-            </w:r>
-          </w:p>
-        </w:tc>
-      </w:tr>
-      <w:tr xmlns:wp14="http://schemas.microsoft.com/office/word/2010/wordml" wp14:textId="77777777">
-        <w:tc>
-          <w:tcPr>
-            <w:tcW w:w="810" w:type="dxa"/>
-            <w:tcMar>
-              <w:top w:w="80" w:type="dxa"/>
-              <w:left w:w="150" w:type="dxa"/>
-              <w:bottom w:w="80" w:type="dxa"/>
-              <w:left w:w="150" w:type="dxa"/>
-              <w:right w:w="150" w:type="dxa"/>
-            </w:tcMar>
-          </w:tcPr>
-          <w:p wp14:textId="77777777">
-            <w:pPr>
-              <w:rPr>
-                <w:rFonts w:ascii="Times New Roman" w:hAnsi="Times New Roman" w:eastAsia="Times New Roman" w:cs="Times New Roman"/>
-                <w:color w:val="auto"/>
-                <w:sz w:val="22"/>
-                <w:szCs w:val="22"/>
-              </w:rPr>
-            </w:pPr>
-            <w:r>
-              <w:rPr>
-                <w:rFonts w:ascii="Times New Roman" w:hAnsi="Times New Roman" w:eastAsia="Times New Roman" w:cs="Times New Roman"/>
-                <w:color w:val="auto"/>
-                <w:sz w:val="22"/>
-                <w:szCs w:val="22"/>
-              </w:rPr>
-              <w:t>TC6</w:t>
-            </w:r>
-          </w:p>
-        </w:tc>
-        <w:tc>
-          <w:tcPr>
-            <w:tcW w:w="3720" w:type="dxa"/>
-            <w:tcMar>
-              <w:top w:w="80" w:type="dxa"/>
-              <w:left w:w="150" w:type="dxa"/>
-              <w:bottom w:w="80" w:type="dxa"/>
-              <w:left w:w="150" w:type="dxa"/>
-              <w:right w:w="150" w:type="dxa"/>
-            </w:tcMar>
-          </w:tcPr>
-          <w:p wp14:textId="77777777">
-            <w:pPr>
-              <w:rPr>
-                <w:rFonts w:ascii="Times New Roman" w:hAnsi="Times New Roman" w:eastAsia="Times New Roman" w:cs="Times New Roman"/>
-                <w:color w:val="auto"/>
-                <w:sz w:val="22"/>
-                <w:szCs w:val="22"/>
-              </w:rPr>
-            </w:pPr>
-            <w:r>
-              <w:rPr>
-                <w:rFonts w:ascii="Times New Roman" w:hAnsi="Times New Roman" w:eastAsia="Times New Roman" w:cs="Times New Roman"/>
-                <w:color w:val="auto"/>
-                <w:sz w:val="22"/>
-                <w:szCs w:val="22"/>
-              </w:rPr>
-              <w:t>strSelection = "2", dblDepositAmount = ""</w:t>
-            </w:r>
-          </w:p>
-        </w:tc>
-        <w:tc>
-          <w:tcPr>
-            <w:tcW w:w="2490" w:type="dxa"/>
-            <w:tcMar>
-              <w:top w:w="80" w:type="dxa"/>
-              <w:left w:w="150" w:type="dxa"/>
-              <w:bottom w:w="80" w:type="dxa"/>
-              <w:left w:w="150" w:type="dxa"/>
-              <w:right w:w="150" w:type="dxa"/>
-            </w:tcMar>
-          </w:tcPr>
-          <w:p wp14:textId="77777777">
-            <w:pPr>
-              <w:jc w:val="center"/>
-              <w:rPr>
-                <w:rFonts w:ascii="Times New Roman" w:hAnsi="Times New Roman" w:eastAsia="Times New Roman" w:cs="Times New Roman"/>
-                <w:color w:val="auto"/>
-                <w:sz w:val="22"/>
-                <w:szCs w:val="22"/>
-              </w:rPr>
-            </w:pPr>
-            <w:r>
-              <w:rPr>
-                <w:rFonts w:ascii="Times New Roman" w:hAnsi="Times New Roman" w:eastAsia="Times New Roman" w:cs="Times New Roman"/>
-                <w:color w:val="auto"/>
-                <w:sz w:val="22"/>
-                <w:szCs w:val="22"/>
-              </w:rPr>
-              <w:t>60%</w:t>
-            </w:r>
-          </w:p>
-        </w:tc>
-        <w:tc>
-          <w:tcPr>
-            <w:tcW w:w="2445" w:type="dxa"/>
-            <w:tcMar>
-              <w:top w:w="80" w:type="dxa"/>
-              <w:left w:w="150" w:type="dxa"/>
-              <w:bottom w:w="80" w:type="dxa"/>
-              <w:left w:w="150" w:type="dxa"/>
-              <w:right w:w="150" w:type="dxa"/>
-            </w:tcMar>
-          </w:tcPr>
-          <w:p wp14:textId="77777777">
-            <w:pPr>
-              <w:jc w:val="center"/>
-              <w:rPr>
-                <w:rFonts w:ascii="Times New Roman" w:hAnsi="Times New Roman" w:eastAsia="Times New Roman" w:cs="Times New Roman"/>
-                <w:color w:val="auto"/>
-                <w:sz w:val="22"/>
-                <w:szCs w:val="22"/>
-              </w:rPr>
-            </w:pPr>
-            <w:r>
-              <w:rPr>
-                <w:rFonts w:ascii="Times New Roman" w:hAnsi="Times New Roman" w:eastAsia="Times New Roman" w:cs="Times New Roman"/>
-                <w:color w:val="auto"/>
-                <w:sz w:val="22"/>
-                <w:szCs w:val="22"/>
-              </w:rPr>
-              <w:t>50%</w:t>
-            </w:r>
-          </w:p>
-        </w:tc>
-      </w:tr>
-      <w:tr xmlns:wp14="http://schemas.microsoft.com/office/word/2010/wordml" wp14:textId="77777777">
-        <w:tc>
-          <w:tcPr>
-            <w:tcW w:w="810" w:type="dxa"/>
-            <w:tcMar>
-              <w:top w:w="80" w:type="dxa"/>
-              <w:left w:w="150" w:type="dxa"/>
-              <w:bottom w:w="80" w:type="dxa"/>
-              <w:left w:w="150" w:type="dxa"/>
-              <w:right w:w="150" w:type="dxa"/>
-            </w:tcMar>
-          </w:tcPr>
-          <w:p wp14:textId="77777777">
-            <w:pPr>
-              <w:rPr>
-                <w:rFonts w:ascii="Times New Roman" w:hAnsi="Times New Roman" w:eastAsia="Times New Roman" w:cs="Times New Roman"/>
-                <w:color w:val="auto"/>
-                <w:sz w:val="22"/>
-                <w:szCs w:val="22"/>
-              </w:rPr>
-            </w:pPr>
-            <w:r>
-              <w:rPr>
-                <w:rFonts w:ascii="Times New Roman" w:hAnsi="Times New Roman" w:eastAsia="Times New Roman" w:cs="Times New Roman"/>
-                <w:color w:val="auto"/>
-                <w:sz w:val="22"/>
-                <w:szCs w:val="22"/>
-              </w:rPr>
-              <w:t>TC7</w:t>
-            </w:r>
-          </w:p>
-        </w:tc>
-        <w:tc>
-          <w:tcPr>
-            <w:tcW w:w="3720" w:type="dxa"/>
-            <w:tcMar>
-              <w:top w:w="80" w:type="dxa"/>
-              <w:left w:w="150" w:type="dxa"/>
-              <w:bottom w:w="80" w:type="dxa"/>
-              <w:left w:w="150" w:type="dxa"/>
-              <w:right w:w="150" w:type="dxa"/>
-            </w:tcMar>
-          </w:tcPr>
-          <w:p wp14:textId="77777777">
-            <w:pPr>
-              <w:rPr>
-                <w:rFonts w:ascii="Times New Roman" w:hAnsi="Times New Roman" w:eastAsia="Times New Roman" w:cs="Times New Roman"/>
-                <w:color w:val="auto"/>
-                <w:sz w:val="22"/>
-                <w:szCs w:val="22"/>
-              </w:rPr>
-            </w:pPr>
-            <w:r>
-              <w:rPr>
-                <w:rFonts w:ascii="Times New Roman" w:hAnsi="Times New Roman" w:eastAsia="Times New Roman" w:cs="Times New Roman"/>
-                <w:color w:val="auto"/>
-                <w:sz w:val="22"/>
-                <w:szCs w:val="22"/>
-              </w:rPr>
-              <w:t>strSelection = "2", dblDepositAmount = "xyz"</w:t>
-            </w:r>
-          </w:p>
-        </w:tc>
-        <w:tc>
-          <w:tcPr>
-            <w:tcW w:w="2490" w:type="dxa"/>
-            <w:tcMar>
-              <w:top w:w="80" w:type="dxa"/>
-              <w:left w:w="150" w:type="dxa"/>
-              <w:bottom w:w="80" w:type="dxa"/>
-              <w:left w:w="150" w:type="dxa"/>
-              <w:right w:w="150" w:type="dxa"/>
-            </w:tcMar>
-          </w:tcPr>
-          <w:p wp14:textId="77777777">
-            <w:pPr>
-              <w:jc w:val="center"/>
-              <w:rPr>
-                <w:rFonts w:ascii="Times New Roman" w:hAnsi="Times New Roman" w:eastAsia="Times New Roman" w:cs="Times New Roman"/>
-                <w:color w:val="auto"/>
-                <w:sz w:val="22"/>
-                <w:szCs w:val="22"/>
-              </w:rPr>
-            </w:pPr>
-            <w:r>
-              <w:rPr>
-                <w:rFonts w:ascii="Times New Roman" w:hAnsi="Times New Roman" w:eastAsia="Times New Roman" w:cs="Times New Roman"/>
-                <w:color w:val="auto"/>
-                <w:sz w:val="22"/>
-                <w:szCs w:val="22"/>
-              </w:rPr>
-              <w:t>80%</w:t>
-            </w:r>
-          </w:p>
-        </w:tc>
-        <w:tc>
-          <w:tcPr>
-            <w:tcW w:w="2445" w:type="dxa"/>
-            <w:tcMar>
-              <w:top w:w="80" w:type="dxa"/>
-              <w:left w:w="150" w:type="dxa"/>
-              <w:bottom w:w="80" w:type="dxa"/>
-              <w:left w:w="150" w:type="dxa"/>
-              <w:right w:w="150" w:type="dxa"/>
-            </w:tcMar>
-          </w:tcPr>
-          <w:p wp14:textId="77777777">
-            <w:pPr>
-              <w:jc w:val="center"/>
-              <w:rPr>
-                <w:rFonts w:ascii="Times New Roman" w:hAnsi="Times New Roman" w:eastAsia="Times New Roman" w:cs="Times New Roman"/>
-                <w:color w:val="auto"/>
-                <w:sz w:val="22"/>
-                <w:szCs w:val="22"/>
-              </w:rPr>
-            </w:pPr>
-            <w:r>
-              <w:rPr>
-                <w:rFonts w:ascii="Times New Roman" w:hAnsi="Times New Roman" w:eastAsia="Times New Roman" w:cs="Times New Roman"/>
-                <w:color w:val="auto"/>
-                <w:sz w:val="22"/>
-                <w:szCs w:val="22"/>
-              </w:rPr>
-              <w:t>75%</w:t>
-            </w:r>
-          </w:p>
-        </w:tc>
-      </w:tr>
-      <w:tr xmlns:wp14="http://schemas.microsoft.com/office/word/2010/wordml" wp14:textId="77777777">
-        <w:tc>
-          <w:tcPr>
-            <w:tcW w:w="810" w:type="dxa"/>
-            <w:tcMar>
-              <w:top w:w="80" w:type="dxa"/>
-              <w:left w:w="150" w:type="dxa"/>
-              <w:bottom w:w="80" w:type="dxa"/>
-              <w:left w:w="150" w:type="dxa"/>
-              <w:right w:w="150" w:type="dxa"/>
-            </w:tcMar>
-          </w:tcPr>
-          <w:p wp14:textId="77777777">
-            <w:pPr>
-              <w:rPr>
-                <w:rFonts w:ascii="Times New Roman" w:hAnsi="Times New Roman" w:eastAsia="Times New Roman" w:cs="Times New Roman"/>
-                <w:color w:val="auto"/>
-                <w:sz w:val="22"/>
-                <w:szCs w:val="22"/>
-              </w:rPr>
-            </w:pPr>
-            <w:r>
-              <w:rPr>
-                <w:rFonts w:ascii="Times New Roman" w:hAnsi="Times New Roman" w:eastAsia="Times New Roman" w:cs="Times New Roman"/>
-                <w:color w:val="auto"/>
-                <w:sz w:val="22"/>
-                <w:szCs w:val="22"/>
-              </w:rPr>
-              <w:t>TC8</w:t>
-            </w:r>
-          </w:p>
-        </w:tc>
-        <w:tc>
-          <w:tcPr>
-            <w:tcW w:w="3720" w:type="dxa"/>
-            <w:tcMar>
-              <w:top w:w="80" w:type="dxa"/>
-              <w:left w:w="150" w:type="dxa"/>
-              <w:bottom w:w="80" w:type="dxa"/>
-              <w:left w:w="150" w:type="dxa"/>
-              <w:right w:w="150" w:type="dxa"/>
-            </w:tcMar>
-          </w:tcPr>
-          <w:p wp14:textId="77777777">
-            <w:pPr>
-              <w:rPr>
-                <w:rFonts w:ascii="Times New Roman" w:hAnsi="Times New Roman" w:eastAsia="Times New Roman" w:cs="Times New Roman"/>
-                <w:color w:val="auto"/>
-                <w:sz w:val="22"/>
-                <w:szCs w:val="22"/>
-              </w:rPr>
-            </w:pPr>
-            <w:r>
-              <w:rPr>
-                <w:rFonts w:ascii="Times New Roman" w:hAnsi="Times New Roman" w:eastAsia="Times New Roman" w:cs="Times New Roman"/>
-                <w:color w:val="auto"/>
-                <w:sz w:val="22"/>
-                <w:szCs w:val="22"/>
-              </w:rPr>
-              <w:t>strSelection = "2", dblDepositAmount = "500"</w:t>
-            </w:r>
-          </w:p>
-        </w:tc>
-        <w:tc>
-          <w:tcPr>
-            <w:tcW w:w="2490" w:type="dxa"/>
-            <w:tcMar>
-              <w:top w:w="80" w:type="dxa"/>
-              <w:left w:w="150" w:type="dxa"/>
-              <w:bottom w:w="80" w:type="dxa"/>
-              <w:left w:w="150" w:type="dxa"/>
-              <w:right w:w="150" w:type="dxa"/>
-            </w:tcMar>
-          </w:tcPr>
-          <w:p wp14:textId="77777777">
-            <w:pPr>
-              <w:jc w:val="center"/>
-              <w:rPr>
-                <w:rFonts w:ascii="Times New Roman" w:hAnsi="Times New Roman" w:eastAsia="Times New Roman" w:cs="Times New Roman"/>
-                <w:color w:val="auto"/>
-                <w:sz w:val="22"/>
-                <w:szCs w:val="22"/>
-              </w:rPr>
-            </w:pPr>
-            <w:r>
-              <w:rPr>
-                <w:rFonts w:ascii="Times New Roman" w:hAnsi="Times New Roman" w:eastAsia="Times New Roman" w:cs="Times New Roman"/>
-                <w:color w:val="auto"/>
-                <w:sz w:val="22"/>
-                <w:szCs w:val="22"/>
-              </w:rPr>
-              <w:t>100%</w:t>
-            </w:r>
-          </w:p>
-        </w:tc>
-        <w:tc>
-          <w:tcPr>
-            <w:tcW w:w="2445" w:type="dxa"/>
-            <w:tcMar>
-              <w:top w:w="80" w:type="dxa"/>
-              <w:left w:w="150" w:type="dxa"/>
-              <w:bottom w:w="80" w:type="dxa"/>
-              <w:left w:w="150" w:type="dxa"/>
-              <w:right w:w="150" w:type="dxa"/>
-            </w:tcMar>
-          </w:tcPr>
-          <w:p wp14:textId="77777777">
-            <w:pPr>
-              <w:jc w:val="center"/>
-              <w:rPr>
-                <w:rFonts w:ascii="Times New Roman" w:hAnsi="Times New Roman" w:eastAsia="Times New Roman" w:cs="Times New Roman"/>
-                <w:color w:val="auto"/>
-                <w:sz w:val="22"/>
-                <w:szCs w:val="22"/>
-              </w:rPr>
-            </w:pPr>
-            <w:r>
-              <w:rPr>
-                <w:rFonts w:ascii="Times New Roman" w:hAnsi="Times New Roman" w:eastAsia="Times New Roman" w:cs="Times New Roman"/>
-                <w:color w:val="auto"/>
-                <w:sz w:val="22"/>
-                <w:szCs w:val="22"/>
-              </w:rPr>
-              <w:t>100%</w:t>
-            </w:r>
-          </w:p>
-        </w:tc>
-      </w:tr>
-      <w:tr xmlns:wp14="http://schemas.microsoft.com/office/word/2010/wordml" wp14:textId="77777777">
-        <w:tc>
-          <w:tcPr>
-            <w:tcW w:w="810" w:type="dxa"/>
-            <w:tcMar>
-              <w:top w:w="80" w:type="dxa"/>
-              <w:left w:w="150" w:type="dxa"/>
-              <w:bottom w:w="80" w:type="dxa"/>
-              <w:left w:w="150" w:type="dxa"/>
-              <w:right w:w="150" w:type="dxa"/>
-            </w:tcMar>
-          </w:tcPr>
-          <w:p wp14:textId="77777777">
-            <w:pPr>
-              <w:rPr>
-                <w:rFonts w:ascii="Times New Roman" w:hAnsi="Times New Roman" w:eastAsia="Times New Roman" w:cs="Times New Roman"/>
-                <w:color w:val="auto"/>
-                <w:sz w:val="22"/>
-                <w:szCs w:val="22"/>
-              </w:rPr>
-            </w:pPr>
-            <w:r>
-              <w:rPr>
-                <w:rFonts w:ascii="Times New Roman" w:hAnsi="Times New Roman" w:eastAsia="Times New Roman" w:cs="Times New Roman"/>
-                <w:color w:val="auto"/>
-                <w:sz w:val="22"/>
-                <w:szCs w:val="22"/>
-              </w:rPr>
-              <w:t>TC9</w:t>
-            </w:r>
-          </w:p>
-        </w:tc>
-        <w:tc>
-          <w:tcPr>
-            <w:tcW w:w="3720" w:type="dxa"/>
-            <w:tcMar>
-              <w:top w:w="80" w:type="dxa"/>
-              <w:left w:w="150" w:type="dxa"/>
-              <w:bottom w:w="80" w:type="dxa"/>
-              <w:left w:w="150" w:type="dxa"/>
-              <w:right w:w="150" w:type="dxa"/>
-            </w:tcMar>
-          </w:tcPr>
-          <w:p wp14:textId="77777777">
-            <w:pPr>
-              <w:rPr>
-                <w:rFonts w:ascii="Times New Roman" w:hAnsi="Times New Roman" w:eastAsia="Times New Roman" w:cs="Times New Roman"/>
-                <w:color w:val="auto"/>
-                <w:sz w:val="22"/>
-                <w:szCs w:val="22"/>
-              </w:rPr>
-            </w:pPr>
-            <w:r>
-              <w:rPr>
-                <w:rFonts w:ascii="Times New Roman" w:hAnsi="Times New Roman" w:eastAsia="Times New Roman" w:cs="Times New Roman"/>
-                <w:color w:val="auto"/>
-                <w:sz w:val="22"/>
-                <w:szCs w:val="22"/>
-              </w:rPr>
-              <w:t>strSelection = "3", strreceivingAcc = ""</w:t>
-            </w:r>
-          </w:p>
-        </w:tc>
-        <w:tc>
-          <w:tcPr>
-            <w:tcW w:w="2490" w:type="dxa"/>
-            <w:tcMar>
-              <w:top w:w="80" w:type="dxa"/>
-              <w:left w:w="150" w:type="dxa"/>
-              <w:bottom w:w="80" w:type="dxa"/>
-              <w:left w:w="150" w:type="dxa"/>
-              <w:right w:w="150" w:type="dxa"/>
-            </w:tcMar>
-          </w:tcPr>
-          <w:p wp14:textId="77777777">
-            <w:pPr>
-              <w:jc w:val="center"/>
-              <w:rPr>
-                <w:rFonts w:ascii="Times New Roman" w:hAnsi="Times New Roman" w:eastAsia="Times New Roman" w:cs="Times New Roman"/>
-                <w:color w:val="auto"/>
-                <w:sz w:val="22"/>
-                <w:szCs w:val="22"/>
-              </w:rPr>
-            </w:pPr>
-            <w:r>
-              <w:rPr>
-                <w:rFonts w:ascii="Times New Roman" w:hAnsi="Times New Roman" w:eastAsia="Times New Roman" w:cs="Times New Roman"/>
-                <w:color w:val="auto"/>
-                <w:sz w:val="22"/>
-                <w:szCs w:val="22"/>
-              </w:rPr>
-              <w:t>25%</w:t>
-            </w:r>
-          </w:p>
-        </w:tc>
-        <w:tc>
-          <w:tcPr>
-            <w:tcW w:w="2445" w:type="dxa"/>
-            <w:tcMar>
-              <w:top w:w="80" w:type="dxa"/>
-              <w:left w:w="150" w:type="dxa"/>
-              <w:bottom w:w="80" w:type="dxa"/>
-              <w:left w:w="150" w:type="dxa"/>
-              <w:right w:w="150" w:type="dxa"/>
-            </w:tcMar>
-          </w:tcPr>
-          <w:p wp14:textId="77777777">
-            <w:pPr>
-              <w:jc w:val="center"/>
-              <w:rPr>
-                <w:rFonts w:ascii="Times New Roman" w:hAnsi="Times New Roman" w:eastAsia="Times New Roman" w:cs="Times New Roman"/>
-                <w:color w:val="auto"/>
-                <w:sz w:val="22"/>
-                <w:szCs w:val="22"/>
-              </w:rPr>
-            </w:pPr>
-            <w:r>
-              <w:rPr>
-                <w:rFonts w:ascii="Times New Roman" w:hAnsi="Times New Roman" w:eastAsia="Times New Roman" w:cs="Times New Roman"/>
-                <w:color w:val="auto"/>
-                <w:sz w:val="22"/>
-                <w:szCs w:val="22"/>
-              </w:rPr>
-              <w:t>20%</w:t>
-            </w:r>
-          </w:p>
-        </w:tc>
-      </w:tr>
-      <w:tr xmlns:wp14="http://schemas.microsoft.com/office/word/2010/wordml" wp14:textId="77777777">
-        <w:tc>
-          <w:tcPr>
-            <w:tcW w:w="810" w:type="dxa"/>
-            <w:tcMar>
-              <w:top w:w="80" w:type="dxa"/>
-              <w:left w:w="150" w:type="dxa"/>
-              <w:bottom w:w="80" w:type="dxa"/>
-              <w:left w:w="150" w:type="dxa"/>
-              <w:right w:w="150" w:type="dxa"/>
-            </w:tcMar>
-          </w:tcPr>
-          <w:p wp14:textId="77777777">
-            <w:pPr>
-              <w:rPr>
-                <w:rFonts w:ascii="Times New Roman" w:hAnsi="Times New Roman" w:eastAsia="Times New Roman" w:cs="Times New Roman"/>
-                <w:color w:val="auto"/>
-                <w:sz w:val="22"/>
-                <w:szCs w:val="22"/>
-              </w:rPr>
-            </w:pPr>
-            <w:r>
-              <w:rPr>
-                <w:rFonts w:ascii="Times New Roman" w:hAnsi="Times New Roman" w:eastAsia="Times New Roman" w:cs="Times New Roman"/>
-                <w:color w:val="auto"/>
-                <w:sz w:val="22"/>
-                <w:szCs w:val="22"/>
-              </w:rPr>
-              <w:t>TC10</w:t>
-            </w:r>
-          </w:p>
-        </w:tc>
-        <w:tc>
-          <w:tcPr>
-            <w:tcW w:w="3720" w:type="dxa"/>
-            <w:tcMar>
-              <w:top w:w="80" w:type="dxa"/>
-              <w:left w:w="150" w:type="dxa"/>
-              <w:bottom w:w="80" w:type="dxa"/>
-              <w:left w:w="150" w:type="dxa"/>
-              <w:right w:w="150" w:type="dxa"/>
-            </w:tcMar>
-          </w:tcPr>
-          <w:p wp14:textId="77777777">
-            <w:pPr>
-              <w:rPr>
-                <w:rFonts w:ascii="Times New Roman" w:hAnsi="Times New Roman" w:eastAsia="Times New Roman" w:cs="Times New Roman"/>
-                <w:color w:val="auto"/>
-                <w:sz w:val="22"/>
-                <w:szCs w:val="22"/>
-              </w:rPr>
-            </w:pPr>
-            <w:r>
-              <w:rPr>
-                <w:rFonts w:ascii="Times New Roman" w:hAnsi="Times New Roman" w:eastAsia="Times New Roman" w:cs="Times New Roman"/>
-                <w:color w:val="auto"/>
-                <w:sz w:val="22"/>
-                <w:szCs w:val="22"/>
-              </w:rPr>
-              <w:t>strSelection = "3", strreceivingAcc = "123"</w:t>
-            </w:r>
-          </w:p>
-        </w:tc>
-        <w:tc>
-          <w:tcPr>
-            <w:tcW w:w="2490" w:type="dxa"/>
-            <w:tcMar>
-              <w:top w:w="80" w:type="dxa"/>
-              <w:left w:w="150" w:type="dxa"/>
-              <w:bottom w:w="80" w:type="dxa"/>
-              <w:left w:w="150" w:type="dxa"/>
-              <w:right w:w="150" w:type="dxa"/>
-            </w:tcMar>
-          </w:tcPr>
-          <w:p wp14:textId="77777777">
-            <w:pPr>
-              <w:jc w:val="center"/>
-              <w:rPr>
-                <w:rFonts w:ascii="Times New Roman" w:hAnsi="Times New Roman" w:eastAsia="Times New Roman" w:cs="Times New Roman"/>
-                <w:color w:val="auto"/>
-                <w:sz w:val="22"/>
-                <w:szCs w:val="22"/>
-              </w:rPr>
-            </w:pPr>
-            <w:r>
-              <w:rPr>
-                <w:rFonts w:ascii="Times New Roman" w:hAnsi="Times New Roman" w:eastAsia="Times New Roman" w:cs="Times New Roman"/>
-                <w:color w:val="auto"/>
-                <w:sz w:val="22"/>
-                <w:szCs w:val="22"/>
-              </w:rPr>
-              <w:t>50%</w:t>
-            </w:r>
-          </w:p>
-        </w:tc>
-        <w:tc>
-          <w:tcPr>
-            <w:tcW w:w="2445" w:type="dxa"/>
-            <w:tcMar>
-              <w:top w:w="80" w:type="dxa"/>
-              <w:left w:w="150" w:type="dxa"/>
-              <w:bottom w:w="80" w:type="dxa"/>
-              <w:left w:w="150" w:type="dxa"/>
-              <w:right w:w="150" w:type="dxa"/>
-            </w:tcMar>
-          </w:tcPr>
-          <w:p wp14:textId="77777777">
-            <w:pPr>
-              <w:jc w:val="center"/>
-              <w:rPr>
-                <w:rFonts w:ascii="Times New Roman" w:hAnsi="Times New Roman" w:eastAsia="Times New Roman" w:cs="Times New Roman"/>
-                <w:color w:val="auto"/>
-                <w:sz w:val="22"/>
-                <w:szCs w:val="22"/>
-              </w:rPr>
-            </w:pPr>
-            <w:r>
-              <w:rPr>
-                <w:rFonts w:ascii="Times New Roman" w:hAnsi="Times New Roman" w:eastAsia="Times New Roman" w:cs="Times New Roman"/>
-                <w:color w:val="auto"/>
-                <w:sz w:val="22"/>
-                <w:szCs w:val="22"/>
-              </w:rPr>
-              <w:t>40%</w:t>
-            </w:r>
-          </w:p>
-        </w:tc>
-      </w:tr>
-      <w:tr xmlns:wp14="http://schemas.microsoft.com/office/word/2010/wordml" wp14:textId="77777777">
-        <w:tc>
-          <w:tcPr>
-            <w:tcW w:w="810" w:type="dxa"/>
-            <w:tcMar>
-              <w:top w:w="80" w:type="dxa"/>
-              <w:left w:w="150" w:type="dxa"/>
-              <w:bottom w:w="80" w:type="dxa"/>
-              <w:left w:w="150" w:type="dxa"/>
-              <w:right w:w="150" w:type="dxa"/>
-            </w:tcMar>
-          </w:tcPr>
-          <w:p wp14:textId="77777777">
-            <w:pPr>
-              <w:rPr>
-                <w:rFonts w:ascii="Times New Roman" w:hAnsi="Times New Roman" w:eastAsia="Times New Roman" w:cs="Times New Roman"/>
-                <w:color w:val="auto"/>
-                <w:sz w:val="22"/>
-                <w:szCs w:val="22"/>
-              </w:rPr>
-            </w:pPr>
-            <w:r>
-              <w:rPr>
-                <w:rFonts w:ascii="Times New Roman" w:hAnsi="Times New Roman" w:eastAsia="Times New Roman" w:cs="Times New Roman"/>
-                <w:color w:val="auto"/>
-                <w:sz w:val="22"/>
-                <w:szCs w:val="22"/>
-              </w:rPr>
-              <w:t>TC11</w:t>
-            </w:r>
-          </w:p>
-        </w:tc>
-        <w:tc>
-          <w:tcPr>
-            <w:tcW w:w="3720" w:type="dxa"/>
-            <w:tcMar>
-              <w:top w:w="80" w:type="dxa"/>
-              <w:left w:w="150" w:type="dxa"/>
-              <w:bottom w:w="80" w:type="dxa"/>
-              <w:left w:w="150" w:type="dxa"/>
-              <w:right w:w="150" w:type="dxa"/>
-            </w:tcMar>
-          </w:tcPr>
-          <w:p wp14:textId="77777777">
-            <w:pPr>
-              <w:rPr>
-                <w:rFonts w:ascii="Times New Roman" w:hAnsi="Times New Roman" w:eastAsia="Times New Roman" w:cs="Times New Roman"/>
-                <w:color w:val="auto"/>
-                <w:sz w:val="22"/>
-                <w:szCs w:val="22"/>
-              </w:rPr>
-            </w:pPr>
-            <w:r>
-              <w:rPr>
-                <w:rFonts w:ascii="Times New Roman" w:hAnsi="Times New Roman" w:eastAsia="Times New Roman" w:cs="Times New Roman"/>
-                <w:color w:val="auto"/>
-                <w:sz w:val="22"/>
-                <w:szCs w:val="22"/>
-              </w:rPr>
-              <w:t>strSelection = "3", strreceivingAcc = "1234567", dbltransferAmt = ""</w:t>
-            </w:r>
-          </w:p>
-        </w:tc>
-        <w:tc>
-          <w:tcPr>
-            <w:tcW w:w="2490" w:type="dxa"/>
-            <w:tcMar>
-              <w:top w:w="80" w:type="dxa"/>
-              <w:left w:w="150" w:type="dxa"/>
-              <w:bottom w:w="80" w:type="dxa"/>
-              <w:left w:w="150" w:type="dxa"/>
-              <w:right w:w="150" w:type="dxa"/>
-            </w:tcMar>
-          </w:tcPr>
-          <w:p wp14:textId="77777777">
-            <w:pPr>
-              <w:jc w:val="center"/>
-              <w:rPr>
-                <w:rFonts w:ascii="Times New Roman" w:hAnsi="Times New Roman" w:eastAsia="Times New Roman" w:cs="Times New Roman"/>
-                <w:color w:val="auto"/>
-                <w:sz w:val="22"/>
-                <w:szCs w:val="22"/>
-              </w:rPr>
-            </w:pPr>
-            <w:r>
-              <w:rPr>
-                <w:rFonts w:ascii="Times New Roman" w:hAnsi="Times New Roman" w:eastAsia="Times New Roman" w:cs="Times New Roman"/>
-                <w:color w:val="auto"/>
-                <w:sz w:val="22"/>
-                <w:szCs w:val="22"/>
-              </w:rPr>
-              <w:t>65%</w:t>
-            </w:r>
-          </w:p>
-        </w:tc>
-        <w:tc>
-          <w:tcPr>
-            <w:tcW w:w="2445" w:type="dxa"/>
-            <w:tcMar>
-              <w:top w:w="80" w:type="dxa"/>
-              <w:left w:w="150" w:type="dxa"/>
-              <w:bottom w:w="80" w:type="dxa"/>
-              <w:left w:w="150" w:type="dxa"/>
-              <w:right w:w="150" w:type="dxa"/>
-            </w:tcMar>
-          </w:tcPr>
-          <w:p wp14:textId="77777777">
-            <w:pPr>
-              <w:jc w:val="center"/>
-              <w:rPr>
-                <w:rFonts w:ascii="Times New Roman" w:hAnsi="Times New Roman" w:eastAsia="Times New Roman" w:cs="Times New Roman"/>
-                <w:color w:val="auto"/>
-                <w:sz w:val="22"/>
-                <w:szCs w:val="22"/>
-              </w:rPr>
-            </w:pPr>
-            <w:r>
-              <w:rPr>
-                <w:rFonts w:ascii="Times New Roman" w:hAnsi="Times New Roman" w:eastAsia="Times New Roman" w:cs="Times New Roman"/>
-                <w:color w:val="auto"/>
-                <w:sz w:val="22"/>
-                <w:szCs w:val="22"/>
-              </w:rPr>
-              <w:t>60%</w:t>
-            </w:r>
-          </w:p>
-        </w:tc>
-      </w:tr>
-      <w:tr xmlns:wp14="http://schemas.microsoft.com/office/word/2010/wordml" wp14:textId="77777777">
-        <w:tc>
-          <w:tcPr>
-            <w:tcW w:w="810" w:type="dxa"/>
-            <w:tcMar>
-              <w:top w:w="80" w:type="dxa"/>
-              <w:left w:w="150" w:type="dxa"/>
-              <w:bottom w:w="80" w:type="dxa"/>
-              <w:left w:w="150" w:type="dxa"/>
-              <w:right w:w="150" w:type="dxa"/>
-            </w:tcMar>
-          </w:tcPr>
-          <w:p wp14:textId="77777777">
-            <w:pPr>
-              <w:rPr>
-                <w:rFonts w:ascii="Times New Roman" w:hAnsi="Times New Roman" w:eastAsia="Times New Roman" w:cs="Times New Roman"/>
-                <w:color w:val="auto"/>
-                <w:sz w:val="22"/>
-                <w:szCs w:val="22"/>
-              </w:rPr>
-            </w:pPr>
-            <w:r>
-              <w:rPr>
-                <w:rFonts w:ascii="Times New Roman" w:hAnsi="Times New Roman" w:eastAsia="Times New Roman" w:cs="Times New Roman"/>
-                <w:color w:val="auto"/>
-                <w:sz w:val="22"/>
-                <w:szCs w:val="22"/>
-              </w:rPr>
-              <w:t>TC12</w:t>
-            </w:r>
-          </w:p>
-        </w:tc>
-        <w:tc>
-          <w:tcPr>
-            <w:tcW w:w="3720" w:type="dxa"/>
-            <w:tcMar>
-              <w:top w:w="80" w:type="dxa"/>
-              <w:left w:w="150" w:type="dxa"/>
-              <w:bottom w:w="80" w:type="dxa"/>
-              <w:left w:w="150" w:type="dxa"/>
-              <w:right w:w="150" w:type="dxa"/>
-            </w:tcMar>
-          </w:tcPr>
-          <w:p wp14:textId="77777777">
-            <w:pPr>
-              <w:rPr>
-                <w:rFonts w:ascii="Times New Roman" w:hAnsi="Times New Roman" w:eastAsia="Times New Roman" w:cs="Times New Roman"/>
-                <w:color w:val="auto"/>
-                <w:sz w:val="22"/>
-                <w:szCs w:val="22"/>
-              </w:rPr>
-            </w:pPr>
-            <w:r>
-              <w:rPr>
-                <w:rFonts w:ascii="Times New Roman" w:hAnsi="Times New Roman" w:eastAsia="Times New Roman" w:cs="Times New Roman"/>
-                <w:color w:val="auto"/>
-                <w:sz w:val="22"/>
-                <w:szCs w:val="22"/>
-              </w:rPr>
-              <w:t>strSelection = "3", strreceivingAcc = "1234567", dbltransferAmt = "invalid"</w:t>
-            </w:r>
-          </w:p>
-        </w:tc>
-        <w:tc>
-          <w:tcPr>
-            <w:tcW w:w="2490" w:type="dxa"/>
-            <w:tcMar>
-              <w:top w:w="80" w:type="dxa"/>
-              <w:left w:w="150" w:type="dxa"/>
-              <w:bottom w:w="80" w:type="dxa"/>
-              <w:left w:w="150" w:type="dxa"/>
-              <w:right w:w="150" w:type="dxa"/>
-            </w:tcMar>
-          </w:tcPr>
-          <w:p wp14:textId="77777777">
-            <w:pPr>
-              <w:jc w:val="center"/>
-              <w:rPr>
-                <w:rFonts w:ascii="Times New Roman" w:hAnsi="Times New Roman" w:eastAsia="Times New Roman" w:cs="Times New Roman"/>
-                <w:color w:val="auto"/>
-                <w:sz w:val="22"/>
-                <w:szCs w:val="22"/>
-              </w:rPr>
-            </w:pPr>
-            <w:r>
-              <w:rPr>
-                <w:rFonts w:ascii="Times New Roman" w:hAnsi="Times New Roman" w:eastAsia="Times New Roman" w:cs="Times New Roman"/>
-                <w:color w:val="auto"/>
-                <w:sz w:val="22"/>
-                <w:szCs w:val="22"/>
-              </w:rPr>
-              <w:t>80%</w:t>
-            </w:r>
-          </w:p>
-        </w:tc>
-        <w:tc>
-          <w:tcPr>
-            <w:tcW w:w="2445" w:type="dxa"/>
-            <w:tcMar>
-              <w:top w:w="80" w:type="dxa"/>
-              <w:left w:w="150" w:type="dxa"/>
-              <w:bottom w:w="80" w:type="dxa"/>
-              <w:left w:w="150" w:type="dxa"/>
-              <w:right w:w="150" w:type="dxa"/>
-            </w:tcMar>
-          </w:tcPr>
-          <w:p wp14:textId="77777777">
-            <w:pPr>
-              <w:jc w:val="center"/>
-              <w:rPr>
-                <w:rFonts w:ascii="Times New Roman" w:hAnsi="Times New Roman" w:eastAsia="Times New Roman" w:cs="Times New Roman"/>
-                <w:color w:val="auto"/>
-                <w:sz w:val="22"/>
-                <w:szCs w:val="22"/>
-              </w:rPr>
-            </w:pPr>
-            <w:r>
-              <w:rPr>
-                <w:rFonts w:ascii="Times New Roman" w:hAnsi="Times New Roman" w:eastAsia="Times New Roman" w:cs="Times New Roman"/>
-                <w:color w:val="auto"/>
-                <w:sz w:val="22"/>
-                <w:szCs w:val="22"/>
-              </w:rPr>
-              <w:t>80%</w:t>
-            </w:r>
-          </w:p>
-        </w:tc>
-      </w:tr>
-      <w:tr xmlns:wp14="http://schemas.microsoft.com/office/word/2010/wordml" wp14:textId="77777777">
-        <w:tc>
-          <w:tcPr>
-            <w:tcW w:w="810" w:type="dxa"/>
-            <w:tcMar>
-              <w:top w:w="80" w:type="dxa"/>
-              <w:left w:w="150" w:type="dxa"/>
-              <w:bottom w:w="80" w:type="dxa"/>
-              <w:left w:w="150" w:type="dxa"/>
-              <w:right w:w="150" w:type="dxa"/>
-            </w:tcMar>
-          </w:tcPr>
-          <w:p wp14:textId="77777777">
-            <w:pPr>
-              <w:rPr>
-                <w:rFonts w:ascii="Times New Roman" w:hAnsi="Times New Roman" w:eastAsia="Times New Roman" w:cs="Times New Roman"/>
-                <w:color w:val="auto"/>
-                <w:sz w:val="22"/>
-                <w:szCs w:val="22"/>
-              </w:rPr>
-            </w:pPr>
-            <w:r>
-              <w:rPr>
-                <w:rFonts w:ascii="Times New Roman" w:hAnsi="Times New Roman" w:eastAsia="Times New Roman" w:cs="Times New Roman"/>
-                <w:color w:val="auto"/>
-                <w:sz w:val="22"/>
-                <w:szCs w:val="22"/>
-              </w:rPr>
-              <w:t>TC13</w:t>
-            </w:r>
-          </w:p>
-        </w:tc>
-        <w:tc>
-          <w:tcPr>
-            <w:tcW w:w="3720" w:type="dxa"/>
-            <w:tcMar>
-              <w:top w:w="80" w:type="dxa"/>
-              <w:left w:w="150" w:type="dxa"/>
-              <w:bottom w:w="80" w:type="dxa"/>
-              <w:left w:w="150" w:type="dxa"/>
-              <w:right w:w="150" w:type="dxa"/>
-            </w:tcMar>
-          </w:tcPr>
-          <w:p wp14:textId="77777777">
-            <w:pPr>
-              <w:rPr>
-                <w:rFonts w:ascii="Times New Roman" w:hAnsi="Times New Roman" w:eastAsia="Times New Roman" w:cs="Times New Roman"/>
-                <w:color w:val="auto"/>
-                <w:sz w:val="22"/>
-                <w:szCs w:val="22"/>
-              </w:rPr>
-            </w:pPr>
-            <w:r>
-              <w:rPr>
-                <w:rFonts w:ascii="Times New Roman" w:hAnsi="Times New Roman" w:eastAsia="Times New Roman" w:cs="Times New Roman"/>
-                <w:color w:val="auto"/>
-                <w:sz w:val="22"/>
-                <w:szCs w:val="22"/>
-              </w:rPr>
-              <w:t>strSelection = "3", strreceivingAcc = "1234567", dbltransferAmt = "300"</w:t>
-            </w:r>
-          </w:p>
-        </w:tc>
-        <w:tc>
-          <w:tcPr>
-            <w:tcW w:w="2490" w:type="dxa"/>
-            <w:tcMar>
-              <w:top w:w="80" w:type="dxa"/>
-              <w:left w:w="150" w:type="dxa"/>
-              <w:bottom w:w="80" w:type="dxa"/>
-              <w:left w:w="150" w:type="dxa"/>
-              <w:right w:w="150" w:type="dxa"/>
-            </w:tcMar>
-          </w:tcPr>
-          <w:p wp14:textId="77777777">
-            <w:pPr>
-              <w:jc w:val="center"/>
-              <w:rPr>
-                <w:rFonts w:ascii="Times New Roman" w:hAnsi="Times New Roman" w:eastAsia="Times New Roman" w:cs="Times New Roman"/>
-                <w:color w:val="auto"/>
-                <w:sz w:val="22"/>
-                <w:szCs w:val="22"/>
-              </w:rPr>
-            </w:pPr>
-            <w:r>
-              <w:rPr>
-                <w:rFonts w:ascii="Times New Roman" w:hAnsi="Times New Roman" w:eastAsia="Times New Roman" w:cs="Times New Roman"/>
-                <w:color w:val="auto"/>
-                <w:sz w:val="22"/>
-                <w:szCs w:val="22"/>
-              </w:rPr>
-              <w:t>100%</w:t>
-            </w:r>
-          </w:p>
-        </w:tc>
-        <w:tc>
-          <w:tcPr>
-            <w:tcW w:w="2445" w:type="dxa"/>
-            <w:tcMar>
-              <w:top w:w="80" w:type="dxa"/>
-              <w:left w:w="150" w:type="dxa"/>
-              <w:bottom w:w="80" w:type="dxa"/>
-              <w:left w:w="150" w:type="dxa"/>
-              <w:right w:w="150" w:type="dxa"/>
-            </w:tcMar>
-          </w:tcPr>
-          <w:p wp14:textId="77777777">
-            <w:pPr>
-              <w:jc w:val="center"/>
-              <w:rPr>
-                <w:rFonts w:ascii="Times New Roman" w:hAnsi="Times New Roman" w:eastAsia="Times New Roman" w:cs="Times New Roman"/>
-                <w:color w:val="auto"/>
-                <w:sz w:val="22"/>
-                <w:szCs w:val="22"/>
-              </w:rPr>
-            </w:pPr>
-            <w:r>
-              <w:rPr>
-                <w:rFonts w:ascii="Times New Roman" w:hAnsi="Times New Roman" w:eastAsia="Times New Roman" w:cs="Times New Roman"/>
-                <w:color w:val="auto"/>
-                <w:sz w:val="22"/>
-                <w:szCs w:val="22"/>
-              </w:rPr>
-              <w:t>100%</w:t>
-            </w:r>
-          </w:p>
-        </w:tc>
-      </w:tr>
-      <w:tr xmlns:wp14="http://schemas.microsoft.com/office/word/2010/wordml" wp14:textId="77777777">
-        <w:tc>
-          <w:tcPr>
-            <w:tcW w:w="810" w:type="dxa"/>
-            <w:tcMar>
-              <w:top w:w="80" w:type="dxa"/>
-              <w:left w:w="150" w:type="dxa"/>
-              <w:bottom w:w="80" w:type="dxa"/>
-              <w:left w:w="150" w:type="dxa"/>
-              <w:right w:w="150" w:type="dxa"/>
-            </w:tcMar>
-          </w:tcPr>
-          <w:p wp14:textId="77777777">
-            <w:pPr>
-              <w:rPr>
-                <w:rFonts w:ascii="Times New Roman" w:hAnsi="Times New Roman" w:eastAsia="Times New Roman" w:cs="Times New Roman"/>
-                <w:color w:val="auto"/>
-                <w:sz w:val="22"/>
-                <w:szCs w:val="22"/>
-              </w:rPr>
-            </w:pPr>
-            <w:r>
-              <w:rPr>
-                <w:rFonts w:ascii="Times New Roman" w:hAnsi="Times New Roman" w:eastAsia="Times New Roman" w:cs="Times New Roman"/>
-                <w:color w:val="auto"/>
-                <w:sz w:val="22"/>
-                <w:szCs w:val="22"/>
-              </w:rPr>
-              <w:t>TC14</w:t>
-            </w:r>
-          </w:p>
-        </w:tc>
-        <w:tc>
-          <w:tcPr>
-            <w:tcW w:w="3720" w:type="dxa"/>
-            <w:tcMar>
-              <w:top w:w="80" w:type="dxa"/>
-              <w:left w:w="150" w:type="dxa"/>
-              <w:bottom w:w="80" w:type="dxa"/>
-              <w:left w:w="150" w:type="dxa"/>
-              <w:right w:w="150" w:type="dxa"/>
-            </w:tcMar>
-          </w:tcPr>
-          <w:p wp14:textId="77777777">
-            <w:pPr>
-              <w:rPr>
-                <w:rFonts w:ascii="Times New Roman" w:hAnsi="Times New Roman" w:eastAsia="Times New Roman" w:cs="Times New Roman"/>
-                <w:color w:val="auto"/>
-                <w:sz w:val="22"/>
-                <w:szCs w:val="22"/>
-              </w:rPr>
-            </w:pPr>
-            <w:r>
-              <w:rPr>
-                <w:rFonts w:ascii="Times New Roman" w:hAnsi="Times New Roman" w:eastAsia="Times New Roman" w:cs="Times New Roman"/>
-                <w:color w:val="auto"/>
-                <w:sz w:val="22"/>
-                <w:szCs w:val="22"/>
-              </w:rPr>
-              <w:t>strSelection = "4"</w:t>
-            </w:r>
-          </w:p>
-        </w:tc>
-        <w:tc>
-          <w:tcPr>
-            <w:tcW w:w="2490" w:type="dxa"/>
-            <w:tcMar>
-              <w:top w:w="80" w:type="dxa"/>
-              <w:left w:w="150" w:type="dxa"/>
-              <w:bottom w:w="80" w:type="dxa"/>
-              <w:left w:w="150" w:type="dxa"/>
-              <w:right w:w="150" w:type="dxa"/>
-            </w:tcMar>
-          </w:tcPr>
-          <w:p wp14:textId="77777777">
-            <w:pPr>
-              <w:jc w:val="center"/>
-              <w:rPr>
-                <w:rFonts w:ascii="Times New Roman" w:hAnsi="Times New Roman" w:eastAsia="Times New Roman" w:cs="Times New Roman"/>
-                <w:color w:val="auto"/>
-                <w:sz w:val="22"/>
-                <w:szCs w:val="22"/>
-              </w:rPr>
-            </w:pPr>
-            <w:r>
-              <w:rPr>
-                <w:rFonts w:ascii="Times New Roman" w:hAnsi="Times New Roman" w:eastAsia="Times New Roman" w:cs="Times New Roman"/>
-                <w:color w:val="auto"/>
-                <w:sz w:val="22"/>
-                <w:szCs w:val="22"/>
-              </w:rPr>
-              <w:t>100%</w:t>
-            </w:r>
-          </w:p>
-        </w:tc>
-        <w:tc>
-          <w:tcPr>
-            <w:tcW w:w="2445" w:type="dxa"/>
-            <w:tcMar>
-              <w:top w:w="80" w:type="dxa"/>
-              <w:left w:w="150" w:type="dxa"/>
-              <w:bottom w:w="80" w:type="dxa"/>
-              <w:left w:w="150" w:type="dxa"/>
-              <w:right w:w="150" w:type="dxa"/>
-            </w:tcMar>
-          </w:tcPr>
-          <w:p wp14:textId="77777777">
-            <w:pPr>
-              <w:jc w:val="center"/>
-              <w:rPr>
-                <w:rFonts w:ascii="Times New Roman" w:hAnsi="Times New Roman" w:eastAsia="Times New Roman" w:cs="Times New Roman"/>
-                <w:color w:val="auto"/>
-                <w:sz w:val="22"/>
-                <w:szCs w:val="22"/>
-              </w:rPr>
-            </w:pPr>
-            <w:r>
-              <w:rPr>
-                <w:rFonts w:ascii="Times New Roman" w:hAnsi="Times New Roman" w:eastAsia="Times New Roman" w:cs="Times New Roman"/>
-                <w:color w:val="auto"/>
-                <w:sz w:val="22"/>
-                <w:szCs w:val="22"/>
-              </w:rPr>
-              <w:t>100%</w:t>
-            </w:r>
-          </w:p>
-        </w:tc>
-      </w:tr>
-      <w:tr xmlns:wp14="http://schemas.microsoft.com/office/word/2010/wordml" wp14:textId="77777777">
-        <w:tc>
-          <w:tcPr>
-            <w:tcW w:w="810" w:type="dxa"/>
-            <w:tcMar>
-              <w:top w:w="80" w:type="dxa"/>
-              <w:left w:w="150" w:type="dxa"/>
-              <w:bottom w:w="80" w:type="dxa"/>
-              <w:left w:w="150" w:type="dxa"/>
-              <w:right w:w="150" w:type="dxa"/>
-            </w:tcMar>
-          </w:tcPr>
-          <w:p wp14:textId="77777777">
-            <w:pPr>
-              <w:rPr>
-                <w:rFonts w:ascii="Times New Roman" w:hAnsi="Times New Roman" w:eastAsia="Times New Roman" w:cs="Times New Roman"/>
-                <w:color w:val="auto"/>
-                <w:sz w:val="22"/>
-                <w:szCs w:val="22"/>
-              </w:rPr>
-            </w:pPr>
-            <w:r>
-              <w:rPr>
-                <w:rFonts w:ascii="Times New Roman" w:hAnsi="Times New Roman" w:eastAsia="Times New Roman" w:cs="Times New Roman"/>
-                <w:color w:val="auto"/>
-                <w:sz w:val="22"/>
-                <w:szCs w:val="22"/>
-              </w:rPr>
-              <w:t>TC15</w:t>
-            </w:r>
-          </w:p>
-        </w:tc>
-        <w:tc>
-          <w:tcPr>
-            <w:tcW w:w="3720" w:type="dxa"/>
-            <w:tcMar>
-              <w:top w:w="80" w:type="dxa"/>
-              <w:left w:w="150" w:type="dxa"/>
-              <w:bottom w:w="80" w:type="dxa"/>
-              <w:left w:w="150" w:type="dxa"/>
-              <w:right w:w="150" w:type="dxa"/>
-            </w:tcMar>
-          </w:tcPr>
-          <w:p wp14:textId="77777777">
-            <w:pPr>
-              <w:rPr>
-                <w:rFonts w:ascii="Times New Roman" w:hAnsi="Times New Roman" w:eastAsia="Times New Roman" w:cs="Times New Roman"/>
-                <w:color w:val="auto"/>
-                <w:sz w:val="22"/>
-                <w:szCs w:val="22"/>
-              </w:rPr>
-            </w:pPr>
-            <w:r>
-              <w:rPr>
-                <w:rFonts w:ascii="Times New Roman" w:hAnsi="Times New Roman" w:eastAsia="Times New Roman" w:cs="Times New Roman"/>
-                <w:color w:val="auto"/>
-                <w:sz w:val="22"/>
-                <w:szCs w:val="22"/>
-              </w:rPr>
-              <w:t>strSelection = "5"</w:t>
-            </w:r>
-          </w:p>
-        </w:tc>
-        <w:tc>
-          <w:tcPr>
-            <w:tcW w:w="2490" w:type="dxa"/>
-            <w:tcMar>
-              <w:top w:w="80" w:type="dxa"/>
-              <w:left w:w="150" w:type="dxa"/>
-              <w:bottom w:w="80" w:type="dxa"/>
-              <w:left w:w="150" w:type="dxa"/>
-              <w:right w:w="150" w:type="dxa"/>
-            </w:tcMar>
-          </w:tcPr>
-          <w:p wp14:textId="77777777">
-            <w:pPr>
-              <w:jc w:val="center"/>
-              <w:rPr>
-                <w:rFonts w:ascii="Times New Roman" w:hAnsi="Times New Roman" w:eastAsia="Times New Roman" w:cs="Times New Roman"/>
-                <w:color w:val="auto"/>
-                <w:sz w:val="22"/>
-                <w:szCs w:val="22"/>
-              </w:rPr>
-            </w:pPr>
-            <w:r>
-              <w:rPr>
-                <w:rFonts w:ascii="Times New Roman" w:hAnsi="Times New Roman" w:eastAsia="Times New Roman" w:cs="Times New Roman"/>
-                <w:color w:val="auto"/>
-                <w:sz w:val="22"/>
-                <w:szCs w:val="22"/>
-              </w:rPr>
-              <w:t>100%</w:t>
-            </w:r>
-          </w:p>
-        </w:tc>
-        <w:tc>
-          <w:tcPr>
-            <w:tcW w:w="2445" w:type="dxa"/>
-            <w:tcMar>
-              <w:top w:w="80" w:type="dxa"/>
-              <w:left w:w="150" w:type="dxa"/>
-              <w:bottom w:w="80" w:type="dxa"/>
-              <w:left w:w="150" w:type="dxa"/>
-              <w:right w:w="150" w:type="dxa"/>
-            </w:tcMar>
-          </w:tcPr>
-          <w:p wp14:textId="77777777">
-            <w:pPr>
-              <w:jc w:val="center"/>
-              <w:rPr>
-                <w:rFonts w:ascii="Times New Roman" w:hAnsi="Times New Roman" w:eastAsia="Times New Roman" w:cs="Times New Roman"/>
-                <w:color w:val="auto"/>
-                <w:sz w:val="22"/>
-                <w:szCs w:val="22"/>
-              </w:rPr>
-            </w:pPr>
-            <w:r>
-              <w:rPr>
-                <w:rFonts w:ascii="Times New Roman" w:hAnsi="Times New Roman" w:eastAsia="Times New Roman" w:cs="Times New Roman"/>
-                <w:color w:val="auto"/>
-                <w:sz w:val="22"/>
-                <w:szCs w:val="22"/>
-              </w:rPr>
-              <w:t>100%</w:t>
-            </w:r>
-          </w:p>
-        </w:tc>
-      </w:tr>
     </w:tbl>
     <w:p xmlns:wp14="http://schemas.microsoft.com/office/word/2010/wordml" wp14:textId="77777777">
       <w:pPr>
@@ -7963,7 +5155,7 @@
         <w:t xml:space="preserve">7.2. </w:t>
       </w:r>
     </w:p>
-    <w:p xmlns:wp14="http://schemas.microsoft.com/office/word/2010/wordml" wp14:textId="61CA97FA">
+    <w:p xmlns:wp14="http://schemas.microsoft.com/office/word/2010/wordml" wp14:textId="11094D0A">
       <w:pPr>
         <w:rPr>
           <w:rFonts w:ascii="Times New Roman" w:hAnsi="Times New Roman" w:eastAsia="Times New Roman" w:cs="Times New Roman"/>
@@ -7979,7 +5171,25 @@
           <w:sz w:val="22"/>
           <w:szCs w:val="22"/>
         </w:rPr>
-        <w:t>Any test input where amount &gt;= 1000 exposes the defect (</w:t>
+        <w:t xml:space="preserve">Any test input where amount &gt;= 1000 </w:t>
+      </w:r>
+      <w:r>
+        <w:rPr>
+          <w:rFonts w:ascii="Times New Roman" w:hAnsi="Times New Roman" w:eastAsia="Times New Roman" w:cs="Times New Roman"/>
+          <w:color w:val="auto"/>
+          <w:sz w:val="22"/>
+          <w:szCs w:val="22"/>
+        </w:rPr>
+        <w:t>show</w:t>
+      </w:r>
+      <w:r>
+        <w:rPr>
+          <w:rFonts w:ascii="Times New Roman" w:hAnsi="Times New Roman" w:eastAsia="Times New Roman" w:cs="Times New Roman"/>
+          <w:color w:val="auto"/>
+          <w:sz w:val="22"/>
+          <w:szCs w:val="22"/>
+        </w:rPr>
+        <w:t>s the defect (</w:t>
       </w:r>
       <w:r>
         <w:rPr>
@@ -8067,14 +5277,19 @@
         <w:t xml:space="preserve">7.4. </w:t>
       </w:r>
     </w:p>
-    <w:p xmlns:wp14="http://schemas.microsoft.com/office/word/2010/wordml" wp14:textId="0DC48B20">
+    <w:p xmlns:wp14="http://schemas.microsoft.com/office/word/2010/wordml" wp14:textId="71EF26DA">
       <w:pPr>
         <w:pStyle w:val="Heading2"/>
         <w:rPr>
           <w:rFonts w:ascii="Times New Roman" w:hAnsi="Times New Roman" w:eastAsia="Times New Roman" w:cs="Times New Roman"/>
           <w:b w:val="0"/>
           <w:bCs w:val="0"/>
+          <w:i w:val="0"/>
+          <w:iCs w:val="0"/>
+          <w:caps w:val="0"/>
+          <w:smallCaps w:val="0"/>
           <w:noProof w:val="0"/>
+          <w:color w:val="303030"/>
           <w:sz w:val="22"/>
           <w:szCs w:val="22"/>
           <w:lang w:val="en-US"/>
@@ -8108,7 +5323,6 @@
         </w:rPr>
         <w:t xml:space="preserve">o fix the defect, the tester first </w:t>
       </w:r>
-      <w:bookmarkStart w:name="_Int_xSmVlbf6" w:id="697684111"/>
       <w:r>
         <w:rPr>
           <w:rFonts w:ascii="Times New Roman" w:hAnsi="Times New Roman" w:eastAsia="Times New Roman" w:cs="Times New Roman"/>
@@ -8126,7 +5340,6 @@
         </w:rPr>
         <w:t>logs</w:t>
       </w:r>
-      <w:bookmarkEnd w:id="697684111"/>
       <w:r>
         <w:rPr>
           <w:rFonts w:ascii="Times New Roman" w:hAnsi="Times New Roman" w:eastAsia="Times New Roman" w:cs="Times New Roman"/>
@@ -8142,7 +5355,398 @@
           <w:szCs w:val="22"/>
           <w:lang w:val="en-US"/>
         </w:rPr>
-        <w:t xml:space="preserve"> a formal report detailing the incorrect output, allowing the developer to locate the line in code and change the multiplier from </w:t>
+        <w:t xml:space="preserve"> a formal report</w:t>
+      </w:r>
+      <w:r>
+        <w:rPr>
+          <w:rFonts w:ascii="Times New Roman" w:hAnsi="Times New Roman" w:eastAsia="Times New Roman" w:cs="Times New Roman"/>
+          <w:b w:val="0"/>
+          <w:bCs w:val="0"/>
+          <w:i w:val="0"/>
+          <w:iCs w:val="0"/>
+          <w:caps w:val="0"/>
+          <w:smallCaps w:val="0"/>
+          <w:noProof w:val="0"/>
+          <w:color w:val="303030"/>
+          <w:sz w:val="22"/>
+          <w:szCs w:val="22"/>
+          <w:lang w:val="en-US"/>
+        </w:rPr>
+        <w:t xml:space="preserve"> detailing the incorrect output</w:t>
+      </w:r>
+      <w:r>
+        <w:rPr>
+          <w:rFonts w:ascii="Times New Roman" w:hAnsi="Times New Roman" w:eastAsia="Times New Roman" w:cs="Times New Roman"/>
+          <w:b w:val="0"/>
+          <w:bCs w:val="0"/>
+          <w:i w:val="0"/>
+          <w:iCs w:val="0"/>
+          <w:caps w:val="0"/>
+          <w:smallCaps w:val="0"/>
+          <w:noProof w:val="0"/>
+          <w:color w:val="303030"/>
+          <w:sz w:val="22"/>
+          <w:szCs w:val="22"/>
+          <w:lang w:val="en-US"/>
+        </w:rPr>
+        <w:t xml:space="preserve"> and the defect that </w:t>
+      </w:r>
+      <w:r>
+        <w:rPr>
+          <w:rFonts w:ascii="Times New Roman" w:hAnsi="Times New Roman" w:eastAsia="Times New Roman" w:cs="Times New Roman"/>
+          <w:b w:val="0"/>
+          <w:bCs w:val="0"/>
+          <w:i w:val="0"/>
+          <w:iCs w:val="0"/>
+          <w:caps w:val="0"/>
+          <w:smallCaps w:val="0"/>
+          <w:noProof w:val="0"/>
+          <w:color w:val="303030"/>
+          <w:sz w:val="22"/>
+          <w:szCs w:val="22"/>
+          <w:lang w:val="en-US"/>
+        </w:rPr>
+        <w:t>caused</w:t>
+      </w:r>
+      <w:r>
+        <w:rPr>
+          <w:rFonts w:ascii="Times New Roman" w:hAnsi="Times New Roman" w:eastAsia="Times New Roman" w:cs="Times New Roman"/>
+          <w:b w:val="0"/>
+          <w:bCs w:val="0"/>
+          <w:i w:val="0"/>
+          <w:iCs w:val="0"/>
+          <w:caps w:val="0"/>
+          <w:smallCaps w:val="0"/>
+          <w:noProof w:val="0"/>
+          <w:color w:val="303030"/>
+          <w:sz w:val="22"/>
+          <w:szCs w:val="22"/>
+          <w:lang w:val="en-US"/>
+        </w:rPr>
+        <w:t xml:space="preserve"> the failure</w:t>
+      </w:r>
+      <w:r>
+        <w:rPr>
+          <w:rFonts w:ascii="Times New Roman" w:hAnsi="Times New Roman" w:eastAsia="Times New Roman" w:cs="Times New Roman"/>
+          <w:b w:val="0"/>
+          <w:bCs w:val="0"/>
+          <w:i w:val="0"/>
+          <w:iCs w:val="0"/>
+          <w:caps w:val="0"/>
+          <w:smallCaps w:val="0"/>
+          <w:noProof w:val="0"/>
+          <w:color w:val="303030"/>
+          <w:sz w:val="22"/>
+          <w:szCs w:val="22"/>
+          <w:lang w:val="en-US"/>
+        </w:rPr>
+        <w:t>, allowing the developer</w:t>
+      </w:r>
+      <w:r>
+        <w:rPr>
+          <w:rFonts w:ascii="Times New Roman" w:hAnsi="Times New Roman" w:eastAsia="Times New Roman" w:cs="Times New Roman"/>
+          <w:b w:val="0"/>
+          <w:bCs w:val="0"/>
+          <w:i w:val="0"/>
+          <w:iCs w:val="0"/>
+          <w:caps w:val="0"/>
+          <w:smallCaps w:val="0"/>
+          <w:noProof w:val="0"/>
+          <w:color w:val="303030"/>
+          <w:sz w:val="22"/>
+          <w:szCs w:val="22"/>
+          <w:lang w:val="en-US"/>
+        </w:rPr>
+        <w:t xml:space="preserve"> to go through the debugging </w:t>
+      </w:r>
+      <w:r>
+        <w:rPr>
+          <w:rFonts w:ascii="Times New Roman" w:hAnsi="Times New Roman" w:eastAsia="Times New Roman" w:cs="Times New Roman"/>
+          <w:b w:val="0"/>
+          <w:bCs w:val="0"/>
+          <w:i w:val="0"/>
+          <w:iCs w:val="0"/>
+          <w:caps w:val="0"/>
+          <w:smallCaps w:val="0"/>
+          <w:noProof w:val="0"/>
+          <w:color w:val="303030"/>
+          <w:sz w:val="22"/>
+          <w:szCs w:val="22"/>
+          <w:lang w:val="en-US"/>
+        </w:rPr>
+        <w:t>process (</w:t>
+      </w:r>
+      <w:r>
+        <w:rPr>
+          <w:rFonts w:ascii="Times New Roman" w:hAnsi="Times New Roman" w:eastAsia="Times New Roman" w:cs="Times New Roman"/>
+          <w:b w:val="0"/>
+          <w:bCs w:val="0"/>
+          <w:i w:val="0"/>
+          <w:iCs w:val="0"/>
+          <w:caps w:val="0"/>
+          <w:smallCaps w:val="0"/>
+          <w:noProof w:val="0"/>
+          <w:color w:val="303030"/>
+          <w:sz w:val="22"/>
+          <w:szCs w:val="22"/>
+          <w:lang w:val="en-US"/>
+        </w:rPr>
+        <w:t xml:space="preserve">process of fixing the defect) </w:t>
+      </w:r>
+      <w:r>
+        <w:rPr>
+          <w:rFonts w:ascii="Times New Roman" w:hAnsi="Times New Roman" w:eastAsia="Times New Roman" w:cs="Times New Roman"/>
+          <w:b w:val="0"/>
+          <w:bCs w:val="0"/>
+          <w:i w:val="0"/>
+          <w:iCs w:val="0"/>
+          <w:caps w:val="0"/>
+          <w:smallCaps w:val="0"/>
+          <w:noProof w:val="0"/>
+          <w:color w:val="303030"/>
+          <w:sz w:val="22"/>
+          <w:szCs w:val="22"/>
+          <w:lang w:val="en-US"/>
+        </w:rPr>
+        <w:t xml:space="preserve">by first reproducing the failure </w:t>
+      </w:r>
+      <w:r>
+        <w:rPr>
+          <w:rFonts w:ascii="Times New Roman" w:hAnsi="Times New Roman" w:eastAsia="Times New Roman" w:cs="Times New Roman"/>
+          <w:b w:val="0"/>
+          <w:bCs w:val="0"/>
+          <w:i w:val="0"/>
+          <w:iCs w:val="0"/>
+          <w:caps w:val="0"/>
+          <w:smallCaps w:val="0"/>
+          <w:noProof w:val="0"/>
+          <w:color w:val="303030"/>
+          <w:sz w:val="22"/>
+          <w:szCs w:val="22"/>
+          <w:lang w:val="en-US"/>
+        </w:rPr>
+        <w:t>that may have been cause by the</w:t>
+      </w:r>
+      <w:r>
+        <w:rPr>
+          <w:rFonts w:ascii="Times New Roman" w:hAnsi="Times New Roman" w:eastAsia="Times New Roman" w:cs="Times New Roman"/>
+          <w:b w:val="0"/>
+          <w:bCs w:val="0"/>
+          <w:i w:val="0"/>
+          <w:iCs w:val="0"/>
+          <w:caps w:val="0"/>
+          <w:smallCaps w:val="0"/>
+          <w:noProof w:val="0"/>
+          <w:color w:val="303030"/>
+          <w:sz w:val="22"/>
+          <w:szCs w:val="22"/>
+          <w:lang w:val="en-US"/>
+        </w:rPr>
+        <w:t xml:space="preserve"> defect then </w:t>
+      </w:r>
+      <w:r>
+        <w:rPr>
+          <w:rFonts w:ascii="Times New Roman" w:hAnsi="Times New Roman" w:eastAsia="Times New Roman" w:cs="Times New Roman"/>
+          <w:b w:val="0"/>
+          <w:bCs w:val="0"/>
+          <w:i w:val="0"/>
+          <w:iCs w:val="0"/>
+          <w:caps w:val="0"/>
+          <w:smallCaps w:val="0"/>
+          <w:noProof w:val="0"/>
+          <w:color w:val="303030"/>
+          <w:sz w:val="22"/>
+          <w:szCs w:val="22"/>
+          <w:lang w:val="en-US"/>
+        </w:rPr>
+        <w:t xml:space="preserve">locate the line in </w:t>
+      </w:r>
+      <w:r>
+        <w:rPr>
+          <w:rFonts w:ascii="Times New Roman" w:hAnsi="Times New Roman" w:eastAsia="Times New Roman" w:cs="Times New Roman"/>
+          <w:b w:val="0"/>
+          <w:bCs w:val="0"/>
+          <w:i w:val="0"/>
+          <w:iCs w:val="0"/>
+          <w:caps w:val="0"/>
+          <w:smallCaps w:val="0"/>
+          <w:noProof w:val="0"/>
+          <w:color w:val="303030"/>
+          <w:sz w:val="22"/>
+          <w:szCs w:val="22"/>
+          <w:lang w:val="en-US"/>
+        </w:rPr>
+        <w:t xml:space="preserve">the </w:t>
+      </w:r>
+      <w:r>
+        <w:rPr>
+          <w:rFonts w:ascii="Times New Roman" w:hAnsi="Times New Roman" w:eastAsia="Times New Roman" w:cs="Times New Roman"/>
+          <w:b w:val="0"/>
+          <w:bCs w:val="0"/>
+          <w:i w:val="0"/>
+          <w:iCs w:val="0"/>
+          <w:caps w:val="0"/>
+          <w:smallCaps w:val="0"/>
+          <w:noProof w:val="0"/>
+          <w:color w:val="303030"/>
+          <w:sz w:val="22"/>
+          <w:szCs w:val="22"/>
+          <w:lang w:val="en-US"/>
+        </w:rPr>
+        <w:t xml:space="preserve">code (root cause) that </w:t>
+      </w:r>
+      <w:r>
+        <w:rPr>
+          <w:rFonts w:ascii="Times New Roman" w:hAnsi="Times New Roman" w:eastAsia="Times New Roman" w:cs="Times New Roman"/>
+          <w:b w:val="0"/>
+          <w:bCs w:val="0"/>
+          <w:i w:val="0"/>
+          <w:iCs w:val="0"/>
+          <w:caps w:val="0"/>
+          <w:smallCaps w:val="0"/>
+          <w:noProof w:val="0"/>
+          <w:color w:val="303030"/>
+          <w:sz w:val="22"/>
+          <w:szCs w:val="22"/>
+          <w:lang w:val="en-US"/>
+        </w:rPr>
+        <w:t xml:space="preserve">may have </w:t>
+      </w:r>
+      <w:r>
+        <w:rPr>
+          <w:rFonts w:ascii="Times New Roman" w:hAnsi="Times New Roman" w:eastAsia="Times New Roman" w:cs="Times New Roman"/>
+          <w:b w:val="0"/>
+          <w:bCs w:val="0"/>
+          <w:i w:val="0"/>
+          <w:iCs w:val="0"/>
+          <w:caps w:val="0"/>
+          <w:smallCaps w:val="0"/>
+          <w:noProof w:val="0"/>
+          <w:color w:val="303030"/>
+          <w:sz w:val="22"/>
+          <w:szCs w:val="22"/>
+          <w:lang w:val="en-US"/>
+        </w:rPr>
+        <w:t>caused the</w:t>
+      </w:r>
+      <w:r>
+        <w:rPr>
+          <w:rFonts w:ascii="Times New Roman" w:hAnsi="Times New Roman" w:eastAsia="Times New Roman" w:cs="Times New Roman"/>
+          <w:b w:val="0"/>
+          <w:bCs w:val="0"/>
+          <w:i w:val="0"/>
+          <w:iCs w:val="0"/>
+          <w:caps w:val="0"/>
+          <w:smallCaps w:val="0"/>
+          <w:noProof w:val="0"/>
+          <w:color w:val="303030"/>
+          <w:sz w:val="22"/>
+          <w:szCs w:val="22"/>
+          <w:lang w:val="en-US"/>
+        </w:rPr>
+        <w:t xml:space="preserve"> failure</w:t>
+      </w:r>
+      <w:r>
+        <w:rPr>
+          <w:rFonts w:ascii="Times New Roman" w:hAnsi="Times New Roman" w:eastAsia="Times New Roman" w:cs="Times New Roman"/>
+          <w:b w:val="0"/>
+          <w:bCs w:val="0"/>
+          <w:i w:val="0"/>
+          <w:iCs w:val="0"/>
+          <w:caps w:val="0"/>
+          <w:smallCaps w:val="0"/>
+          <w:noProof w:val="0"/>
+          <w:color w:val="303030"/>
+          <w:sz w:val="22"/>
+          <w:szCs w:val="22"/>
+          <w:lang w:val="en-US"/>
+        </w:rPr>
+        <w:t xml:space="preserve"> </w:t>
+      </w:r>
+      <w:r>
+        <w:rPr>
+          <w:rFonts w:ascii="Times New Roman" w:hAnsi="Times New Roman" w:eastAsia="Times New Roman" w:cs="Times New Roman"/>
+          <w:b w:val="0"/>
+          <w:bCs w:val="0"/>
+          <w:i w:val="0"/>
+          <w:iCs w:val="0"/>
+          <w:caps w:val="0"/>
+          <w:smallCaps w:val="0"/>
+          <w:noProof w:val="0"/>
+          <w:color w:val="303030"/>
+          <w:sz w:val="22"/>
+          <w:szCs w:val="22"/>
+          <w:lang w:val="en-US"/>
+        </w:rPr>
+        <w:t xml:space="preserve">and </w:t>
+      </w:r>
+      <w:r>
+        <w:rPr>
+          <w:rFonts w:ascii="Times New Roman" w:hAnsi="Times New Roman" w:eastAsia="Times New Roman" w:cs="Times New Roman"/>
+          <w:b w:val="0"/>
+          <w:bCs w:val="0"/>
+          <w:i w:val="0"/>
+          <w:iCs w:val="0"/>
+          <w:caps w:val="0"/>
+          <w:smallCaps w:val="0"/>
+          <w:noProof w:val="0"/>
+          <w:color w:val="303030"/>
+          <w:sz w:val="22"/>
+          <w:szCs w:val="22"/>
+          <w:lang w:val="en-US"/>
+        </w:rPr>
+        <w:t xml:space="preserve">fix it by </w:t>
+      </w:r>
+      <w:r>
+        <w:rPr>
+          <w:rFonts w:ascii="Times New Roman" w:hAnsi="Times New Roman" w:eastAsia="Times New Roman" w:cs="Times New Roman"/>
+          <w:b w:val="0"/>
+          <w:bCs w:val="0"/>
+          <w:i w:val="0"/>
+          <w:iCs w:val="0"/>
+          <w:caps w:val="0"/>
+          <w:smallCaps w:val="0"/>
+          <w:noProof w:val="0"/>
+          <w:color w:val="303030"/>
+          <w:sz w:val="22"/>
+          <w:szCs w:val="22"/>
+          <w:lang w:val="en-US"/>
+        </w:rPr>
+        <w:t>chang</w:t>
+      </w:r>
+      <w:r>
+        <w:rPr>
+          <w:rFonts w:ascii="Times New Roman" w:hAnsi="Times New Roman" w:eastAsia="Times New Roman" w:cs="Times New Roman"/>
+          <w:b w:val="0"/>
+          <w:bCs w:val="0"/>
+          <w:i w:val="0"/>
+          <w:iCs w:val="0"/>
+          <w:caps w:val="0"/>
+          <w:smallCaps w:val="0"/>
+          <w:noProof w:val="0"/>
+          <w:color w:val="303030"/>
+          <w:sz w:val="22"/>
+          <w:szCs w:val="22"/>
+          <w:lang w:val="en-US"/>
+        </w:rPr>
+        <w:t>ing</w:t>
+      </w:r>
+      <w:r>
+        <w:rPr>
+          <w:rFonts w:ascii="Times New Roman" w:hAnsi="Times New Roman" w:eastAsia="Times New Roman" w:cs="Times New Roman"/>
+          <w:b w:val="0"/>
+          <w:bCs w:val="0"/>
+          <w:i w:val="0"/>
+          <w:iCs w:val="0"/>
+          <w:caps w:val="0"/>
+          <w:smallCaps w:val="0"/>
+          <w:noProof w:val="0"/>
+          <w:color w:val="303030"/>
+          <w:sz w:val="22"/>
+          <w:szCs w:val="22"/>
+          <w:lang w:val="en-US"/>
+        </w:rPr>
+        <w:t xml:space="preserve"> the multiplier from </w:t>
       </w:r>
       <w:r>
         <w:rPr>
@@ -8210,7 +5814,179 @@
           <w:szCs w:val="22"/>
           <w:lang w:val="en-US"/>
         </w:rPr>
-        <w:t xml:space="preserve"> (5%). Once the fix is checked in, two vital types of testing must be performed: </w:t>
+        <w:t xml:space="preserve"> (5%). Once the fix is checked in</w:t>
+      </w:r>
+      <w:r>
+        <w:rPr>
+          <w:rFonts w:ascii="Times New Roman" w:hAnsi="Times New Roman" w:eastAsia="Times New Roman" w:cs="Times New Roman"/>
+          <w:b w:val="0"/>
+          <w:bCs w:val="0"/>
+          <w:i w:val="0"/>
+          <w:iCs w:val="0"/>
+          <w:caps w:val="0"/>
+          <w:smallCaps w:val="0"/>
+          <w:noProof w:val="0"/>
+          <w:color w:val="303030"/>
+          <w:sz w:val="22"/>
+          <w:szCs w:val="22"/>
+          <w:lang w:val="en-US"/>
+        </w:rPr>
+        <w:t xml:space="preserve"> or </w:t>
+      </w:r>
+      <w:r>
+        <w:rPr>
+          <w:rFonts w:ascii="Times New Roman" w:hAnsi="Times New Roman" w:eastAsia="Times New Roman" w:cs="Times New Roman"/>
+          <w:b w:val="0"/>
+          <w:bCs w:val="0"/>
+          <w:i w:val="0"/>
+          <w:iCs w:val="0"/>
+          <w:caps w:val="0"/>
+          <w:smallCaps w:val="0"/>
+          <w:noProof w:val="0"/>
+          <w:color w:val="303030"/>
+          <w:sz w:val="22"/>
+          <w:szCs w:val="22"/>
+          <w:lang w:val="en-US"/>
+        </w:rPr>
+        <w:t>logged</w:t>
+      </w:r>
+      <w:r>
+        <w:rPr>
+          <w:rFonts w:ascii="Times New Roman" w:hAnsi="Times New Roman" w:eastAsia="Times New Roman" w:cs="Times New Roman"/>
+          <w:b w:val="0"/>
+          <w:bCs w:val="0"/>
+          <w:i w:val="0"/>
+          <w:iCs w:val="0"/>
+          <w:caps w:val="0"/>
+          <w:smallCaps w:val="0"/>
+          <w:noProof w:val="0"/>
+          <w:color w:val="303030"/>
+          <w:sz w:val="22"/>
+          <w:szCs w:val="22"/>
+          <w:lang w:val="en-US"/>
+        </w:rPr>
+        <w:t xml:space="preserve">, two types of testing </w:t>
+      </w:r>
+      <w:bookmarkStart w:name="_Int_5CqhEFwS" w:id="56880691"/>
+      <w:r>
+        <w:rPr>
+          <w:rFonts w:ascii="Times New Roman" w:hAnsi="Times New Roman" w:eastAsia="Times New Roman" w:cs="Times New Roman"/>
+          <w:b w:val="0"/>
+          <w:bCs w:val="0"/>
+          <w:i w:val="0"/>
+          <w:iCs w:val="0"/>
+          <w:caps w:val="0"/>
+          <w:smallCaps w:val="0"/>
+          <w:noProof w:val="0"/>
+          <w:color w:val="303030"/>
+          <w:sz w:val="22"/>
+          <w:szCs w:val="22"/>
+          <w:lang w:val="en-US"/>
+        </w:rPr>
+        <w:t>is</w:t>
+      </w:r>
+      <w:bookmarkEnd w:id="56880691"/>
+      <w:r>
+        <w:rPr>
+          <w:rFonts w:ascii="Times New Roman" w:hAnsi="Times New Roman" w:eastAsia="Times New Roman" w:cs="Times New Roman"/>
+          <w:b w:val="0"/>
+          <w:bCs w:val="0"/>
+          <w:i w:val="0"/>
+          <w:iCs w:val="0"/>
+          <w:caps w:val="0"/>
+          <w:smallCaps w:val="0"/>
+          <w:noProof w:val="0"/>
+          <w:color w:val="303030"/>
+          <w:sz w:val="22"/>
+          <w:szCs w:val="22"/>
+          <w:lang w:val="en-US"/>
+        </w:rPr>
+        <w:t xml:space="preserve"> </w:t>
+      </w:r>
+      <w:r>
+        <w:rPr>
+          <w:rFonts w:ascii="Times New Roman" w:hAnsi="Times New Roman" w:eastAsia="Times New Roman" w:cs="Times New Roman"/>
+          <w:b w:val="0"/>
+          <w:bCs w:val="0"/>
+          <w:i w:val="0"/>
+          <w:iCs w:val="0"/>
+          <w:caps w:val="0"/>
+          <w:smallCaps w:val="0"/>
+          <w:noProof w:val="0"/>
+          <w:color w:val="303030"/>
+          <w:sz w:val="22"/>
+          <w:szCs w:val="22"/>
+          <w:lang w:val="en-US"/>
+        </w:rPr>
+        <w:t>needed</w:t>
+      </w:r>
+      <w:r>
+        <w:rPr>
+          <w:rFonts w:ascii="Times New Roman" w:hAnsi="Times New Roman" w:eastAsia="Times New Roman" w:cs="Times New Roman"/>
+          <w:b w:val="0"/>
+          <w:bCs w:val="0"/>
+          <w:i w:val="0"/>
+          <w:iCs w:val="0"/>
+          <w:caps w:val="0"/>
+          <w:smallCaps w:val="0"/>
+          <w:noProof w:val="0"/>
+          <w:color w:val="303030"/>
+          <w:sz w:val="22"/>
+          <w:szCs w:val="22"/>
+          <w:lang w:val="en-US"/>
+        </w:rPr>
+        <w:t xml:space="preserve"> to</w:t>
+      </w:r>
+      <w:r>
+        <w:rPr>
+          <w:rFonts w:ascii="Times New Roman" w:hAnsi="Times New Roman" w:eastAsia="Times New Roman" w:cs="Times New Roman"/>
+          <w:b w:val="0"/>
+          <w:bCs w:val="0"/>
+          <w:i w:val="0"/>
+          <w:iCs w:val="0"/>
+          <w:caps w:val="0"/>
+          <w:smallCaps w:val="0"/>
+          <w:noProof w:val="0"/>
+          <w:color w:val="303030"/>
+          <w:sz w:val="22"/>
+          <w:szCs w:val="22"/>
+          <w:lang w:val="en-US"/>
+        </w:rPr>
+        <w:t xml:space="preserve"> be </w:t>
+      </w:r>
+      <w:r>
+        <w:rPr>
+          <w:rFonts w:ascii="Times New Roman" w:hAnsi="Times New Roman" w:eastAsia="Times New Roman" w:cs="Times New Roman"/>
+          <w:b w:val="0"/>
+          <w:bCs w:val="0"/>
+          <w:i w:val="0"/>
+          <w:iCs w:val="0"/>
+          <w:caps w:val="0"/>
+          <w:smallCaps w:val="0"/>
+          <w:noProof w:val="0"/>
+          <w:color w:val="303030"/>
+          <w:sz w:val="22"/>
+          <w:szCs w:val="22"/>
+          <w:lang w:val="en-US"/>
+        </w:rPr>
+        <w:t>done. The first is</w:t>
+      </w:r>
+      <w:r>
+        <w:rPr>
+          <w:rFonts w:ascii="Times New Roman" w:hAnsi="Times New Roman" w:eastAsia="Times New Roman" w:cs="Times New Roman"/>
+          <w:b w:val="0"/>
+          <w:bCs w:val="0"/>
+          <w:i w:val="0"/>
+          <w:iCs w:val="0"/>
+          <w:caps w:val="0"/>
+          <w:smallCaps w:val="0"/>
+          <w:noProof w:val="0"/>
+          <w:color w:val="303030"/>
+          <w:sz w:val="22"/>
+          <w:szCs w:val="22"/>
+          <w:lang w:val="en-US"/>
+        </w:rPr>
+        <w:t xml:space="preserve"> </w:t>
       </w:r>
       <w:r>
         <w:rPr>
@@ -8244,7 +6020,92 @@
           <w:szCs w:val="22"/>
           <w:lang w:val="en-US"/>
         </w:rPr>
-        <w:t xml:space="preserve"> to run the original test case and verify that spending R1,000 now correctly returns an R50 discount, and </w:t>
+        <w:t xml:space="preserve"> to run the original test case and verify that spending R1,000 now correctly returns an R50 discount</w:t>
+      </w:r>
+      <w:r>
+        <w:rPr>
+          <w:rFonts w:ascii="Times New Roman" w:hAnsi="Times New Roman" w:eastAsia="Times New Roman" w:cs="Times New Roman"/>
+          <w:b w:val="0"/>
+          <w:bCs w:val="0"/>
+          <w:i w:val="0"/>
+          <w:iCs w:val="0"/>
+          <w:caps w:val="0"/>
+          <w:smallCaps w:val="0"/>
+          <w:noProof w:val="0"/>
+          <w:color w:val="303030"/>
+          <w:sz w:val="22"/>
+          <w:szCs w:val="22"/>
+          <w:lang w:val="en-US"/>
+        </w:rPr>
+        <w:t xml:space="preserve"> so it is to check if the defect </w:t>
+      </w:r>
+      <w:r>
+        <w:rPr>
+          <w:rFonts w:ascii="Times New Roman" w:hAnsi="Times New Roman" w:eastAsia="Times New Roman" w:cs="Times New Roman"/>
+          <w:b w:val="0"/>
+          <w:bCs w:val="0"/>
+          <w:i w:val="0"/>
+          <w:iCs w:val="0"/>
+          <w:caps w:val="0"/>
+          <w:smallCaps w:val="0"/>
+          <w:noProof w:val="0"/>
+          <w:color w:val="303030"/>
+          <w:sz w:val="22"/>
+          <w:szCs w:val="22"/>
+          <w:lang w:val="en-US"/>
+        </w:rPr>
+        <w:t xml:space="preserve">that may have caused the failure </w:t>
+      </w:r>
+      <w:r>
+        <w:rPr>
+          <w:rFonts w:ascii="Times New Roman" w:hAnsi="Times New Roman" w:eastAsia="Times New Roman" w:cs="Times New Roman"/>
+          <w:b w:val="0"/>
+          <w:bCs w:val="0"/>
+          <w:i w:val="0"/>
+          <w:iCs w:val="0"/>
+          <w:caps w:val="0"/>
+          <w:smallCaps w:val="0"/>
+          <w:noProof w:val="0"/>
+          <w:color w:val="303030"/>
+          <w:sz w:val="22"/>
+          <w:szCs w:val="22"/>
+          <w:lang w:val="en-US"/>
+        </w:rPr>
+        <w:t>has been fixed</w:t>
+      </w:r>
+      <w:r>
+        <w:rPr>
+          <w:rFonts w:ascii="Times New Roman" w:hAnsi="Times New Roman" w:eastAsia="Times New Roman" w:cs="Times New Roman"/>
+          <w:b w:val="0"/>
+          <w:bCs w:val="0"/>
+          <w:i w:val="0"/>
+          <w:iCs w:val="0"/>
+          <w:caps w:val="0"/>
+          <w:smallCaps w:val="0"/>
+          <w:noProof w:val="0"/>
+          <w:color w:val="303030"/>
+          <w:sz w:val="22"/>
+          <w:szCs w:val="22"/>
+          <w:lang w:val="en-US"/>
+        </w:rPr>
+        <w:t xml:space="preserve"> and </w:t>
+      </w:r>
+      <w:r>
+        <w:rPr>
+          <w:rFonts w:ascii="Times New Roman" w:hAnsi="Times New Roman" w:eastAsia="Times New Roman" w:cs="Times New Roman"/>
+          <w:b w:val="0"/>
+          <w:bCs w:val="0"/>
+          <w:i w:val="0"/>
+          <w:iCs w:val="0"/>
+          <w:caps w:val="0"/>
+          <w:smallCaps w:val="0"/>
+          <w:noProof w:val="0"/>
+          <w:color w:val="303030"/>
+          <w:sz w:val="22"/>
+          <w:szCs w:val="22"/>
+          <w:lang w:val="en-US"/>
+        </w:rPr>
+        <w:t xml:space="preserve">the second is </w:t>
       </w:r>
       <w:r>
         <w:rPr>
@@ -8278,7 +6139,177 @@
           <w:szCs w:val="22"/>
           <w:lang w:val="en-US"/>
         </w:rPr>
-        <w:t xml:space="preserve"> to ensure that modifying this calculation did not introduce new errors or break unedited parts of the system.</w:t>
+        <w:t xml:space="preserve"> to ensure that </w:t>
+      </w:r>
+      <w:r>
+        <w:rPr>
+          <w:rFonts w:ascii="Times New Roman" w:hAnsi="Times New Roman" w:eastAsia="Times New Roman" w:cs="Times New Roman"/>
+          <w:b w:val="0"/>
+          <w:bCs w:val="0"/>
+          <w:i w:val="0"/>
+          <w:iCs w:val="0"/>
+          <w:caps w:val="0"/>
+          <w:smallCaps w:val="0"/>
+          <w:noProof w:val="0"/>
+          <w:color w:val="303030"/>
+          <w:sz w:val="22"/>
+          <w:szCs w:val="22"/>
+          <w:lang w:val="en-US"/>
+        </w:rPr>
+        <w:t>fixing the defect</w:t>
+      </w:r>
+      <w:r>
+        <w:rPr>
+          <w:rFonts w:ascii="Times New Roman" w:hAnsi="Times New Roman" w:eastAsia="Times New Roman" w:cs="Times New Roman"/>
+          <w:b w:val="0"/>
+          <w:bCs w:val="0"/>
+          <w:i w:val="0"/>
+          <w:iCs w:val="0"/>
+          <w:caps w:val="0"/>
+          <w:smallCaps w:val="0"/>
+          <w:noProof w:val="0"/>
+          <w:color w:val="303030"/>
+          <w:sz w:val="22"/>
+          <w:szCs w:val="22"/>
+          <w:lang w:val="en-US"/>
+        </w:rPr>
+        <w:t xml:space="preserve"> </w:t>
+      </w:r>
+      <w:r>
+        <w:rPr>
+          <w:rFonts w:ascii="Times New Roman" w:hAnsi="Times New Roman" w:eastAsia="Times New Roman" w:cs="Times New Roman"/>
+          <w:b w:val="0"/>
+          <w:bCs w:val="0"/>
+          <w:i w:val="0"/>
+          <w:iCs w:val="0"/>
+          <w:caps w:val="0"/>
+          <w:smallCaps w:val="0"/>
+          <w:noProof w:val="0"/>
+          <w:color w:val="303030"/>
+          <w:sz w:val="22"/>
+          <w:szCs w:val="22"/>
+          <w:lang w:val="en-US"/>
+        </w:rPr>
+        <w:t xml:space="preserve">of </w:t>
+      </w:r>
+      <w:r>
+        <w:rPr>
+          <w:rFonts w:ascii="Times New Roman" w:hAnsi="Times New Roman" w:eastAsia="Times New Roman" w:cs="Times New Roman"/>
+          <w:b w:val="0"/>
+          <w:bCs w:val="0"/>
+          <w:i w:val="0"/>
+          <w:iCs w:val="0"/>
+          <w:caps w:val="0"/>
+          <w:smallCaps w:val="0"/>
+          <w:noProof w:val="0"/>
+          <w:color w:val="303030"/>
+          <w:sz w:val="22"/>
+          <w:szCs w:val="22"/>
+          <w:lang w:val="en-US"/>
+        </w:rPr>
+        <w:t xml:space="preserve">this calculation did not </w:t>
+      </w:r>
+      <w:r>
+        <w:rPr>
+          <w:rFonts w:ascii="Times New Roman" w:hAnsi="Times New Roman" w:eastAsia="Times New Roman" w:cs="Times New Roman"/>
+          <w:b w:val="0"/>
+          <w:bCs w:val="0"/>
+          <w:i w:val="0"/>
+          <w:iCs w:val="0"/>
+          <w:caps w:val="0"/>
+          <w:smallCaps w:val="0"/>
+          <w:noProof w:val="0"/>
+          <w:color w:val="303030"/>
+          <w:sz w:val="22"/>
+          <w:szCs w:val="22"/>
+          <w:lang w:val="en-US"/>
+        </w:rPr>
+        <w:t>bring</w:t>
+      </w:r>
+      <w:r>
+        <w:rPr>
+          <w:rFonts w:ascii="Times New Roman" w:hAnsi="Times New Roman" w:eastAsia="Times New Roman" w:cs="Times New Roman"/>
+          <w:b w:val="0"/>
+          <w:bCs w:val="0"/>
+          <w:i w:val="0"/>
+          <w:iCs w:val="0"/>
+          <w:caps w:val="0"/>
+          <w:smallCaps w:val="0"/>
+          <w:noProof w:val="0"/>
+          <w:color w:val="303030"/>
+          <w:sz w:val="22"/>
+          <w:szCs w:val="22"/>
+          <w:lang w:val="en-US"/>
+        </w:rPr>
+        <w:t xml:space="preserve"> new </w:t>
+      </w:r>
+      <w:r>
+        <w:rPr>
+          <w:rFonts w:ascii="Times New Roman" w:hAnsi="Times New Roman" w:eastAsia="Times New Roman" w:cs="Times New Roman"/>
+          <w:b w:val="0"/>
+          <w:bCs w:val="0"/>
+          <w:i w:val="0"/>
+          <w:iCs w:val="0"/>
+          <w:caps w:val="0"/>
+          <w:smallCaps w:val="0"/>
+          <w:noProof w:val="0"/>
+          <w:color w:val="303030"/>
+          <w:sz w:val="22"/>
+          <w:szCs w:val="22"/>
+          <w:lang w:val="en-US"/>
+        </w:rPr>
+        <w:t>defects</w:t>
+      </w:r>
+      <w:r>
+        <w:rPr>
+          <w:rFonts w:ascii="Times New Roman" w:hAnsi="Times New Roman" w:eastAsia="Times New Roman" w:cs="Times New Roman"/>
+          <w:b w:val="0"/>
+          <w:bCs w:val="0"/>
+          <w:i w:val="0"/>
+          <w:iCs w:val="0"/>
+          <w:caps w:val="0"/>
+          <w:smallCaps w:val="0"/>
+          <w:noProof w:val="0"/>
+          <w:color w:val="303030"/>
+          <w:sz w:val="22"/>
+          <w:szCs w:val="22"/>
+          <w:lang w:val="en-US"/>
+        </w:rPr>
+        <w:t xml:space="preserve"> or break un</w:t>
+      </w:r>
+      <w:r>
+        <w:rPr>
+          <w:rFonts w:ascii="Times New Roman" w:hAnsi="Times New Roman" w:eastAsia="Times New Roman" w:cs="Times New Roman"/>
+          <w:b w:val="0"/>
+          <w:bCs w:val="0"/>
+          <w:i w:val="0"/>
+          <w:iCs w:val="0"/>
+          <w:caps w:val="0"/>
+          <w:smallCaps w:val="0"/>
+          <w:noProof w:val="0"/>
+          <w:color w:val="303030"/>
+          <w:sz w:val="22"/>
+          <w:szCs w:val="22"/>
+          <w:lang w:val="en-US"/>
+        </w:rPr>
+        <w:t>changed</w:t>
+      </w:r>
+      <w:r>
+        <w:rPr>
+          <w:rFonts w:ascii="Times New Roman" w:hAnsi="Times New Roman" w:eastAsia="Times New Roman" w:cs="Times New Roman"/>
+          <w:b w:val="0"/>
+          <w:bCs w:val="0"/>
+          <w:i w:val="0"/>
+          <w:iCs w:val="0"/>
+          <w:caps w:val="0"/>
+          <w:smallCaps w:val="0"/>
+          <w:noProof w:val="0"/>
+          <w:color w:val="303030"/>
+          <w:sz w:val="22"/>
+          <w:szCs w:val="22"/>
+          <w:lang w:val="en-US"/>
+        </w:rPr>
+        <w:t xml:space="preserve"> parts of the system.</w:t>
       </w:r>
     </w:p>
     <w:sectPr>
@@ -8294,7 +6325,7 @@
 <file path=word/intelligence2.xml><?xml version="1.0" encoding="utf-8"?>
 <int2:intelligence xmlns:int2="http://schemas.microsoft.com/office/intelligence/2020/intelligence">
   <int2:observations>
-    <int2:bookmark int2:bookmarkName="_Int_xSmVlbf6" int2:invalidationBookmarkName="" int2:hashCode="R0x5dxPzeQGSiq" int2:id="Rj1972IH">
+    <int2:bookmark int2:bookmarkName="_Int_5CqhEFwS" int2:invalidationBookmarkName="" int2:hashCode="tH82PitDDAZH8U" int2:id="FZbf1OuK">
       <int2:state int2:type="gram" int2:value="Rejected"/>
     </int2:bookmark>
   </int2:observations>

</xml_diff>